<commit_message>
Implement committee signer flow for docs 3/7/8
Adds committee member selection from the system in document 3, carries each selected signer ID with the printed name through documents 4, 5, 7, and 8, and enforces unique committee accounts for the three doc-7 signers. Updates the person picker, signature slots, workflow validation, and templates so doc-7/8 signing stays tied to the authorized committee members. Also includes the doc-7 signature box spacing fix and new PDF/E2E tests covering committee circulation and signing.
</commit_message>
<xml_diff>
--- a/HRCP-KKU-Academic/src/main/resources/templates/docx/doc_7.docx
+++ b/HRCP-KKU-Academic/src/main/resources/templates/docx/doc_7.docx
@@ -3562,9 +3562,9 @@
                   <wp:posOffset>3715385</wp:posOffset>
                 </wp:positionH>
                 <wp:positionV relativeFrom="page">
-                  <wp:posOffset>7809230</wp:posOffset>
+                  <wp:posOffset>6413500</wp:posOffset>
                 </wp:positionV>
-                <wp:extent cx="2764800" cy="2160000"/>
+                <wp:extent cx="2764800" cy="3492500"/>
                 <wp:effectExtent l="0" t="0" r="3810" b="0"/>
                 <wp:wrapSquare wrapText="bothSides"/>
                 <wp:docPr id="217" name="กล่องข้อความ 2"/>
@@ -3580,7 +3580,7 @@
                       <wps:spPr bwMode="auto">
                         <a:xfrm>
                           <a:off x="0" y="0"/>
-                          <a:ext cx="2764800" cy="2160000"/>
+                          <a:ext cx="2764800" cy="3492500"/>
                         </a:xfrm>
                         <a:prstGeom prst="rect">
                           <a:avLst/>
@@ -3864,7 +3864,7 @@
                 <v:stroke joinstyle="miter"/>
                 <v:path gradientshapeok="t" o:connecttype="rect"/>
               </v:shapetype>
-              <v:shape id="กล่องข้อความ 2" o:spid="_x0000_s1026" type="#_x0000_t202" style="position:absolute;margin-left:292.55pt;margin-top:614.9pt;width:217.7pt;height:170.1pt;z-index:251679744;visibility:visible;mso-wrap-style:square;mso-width-percent:0;mso-height-percent:0;mso-wrap-distance-left:9pt;mso-wrap-distance-top:3.6pt;mso-wrap-distance-right:9pt;mso-wrap-distance-bottom:3.6pt;mso-position-horizontal:absolute;mso-position-horizontal-relative:margin;mso-position-vertical:absolute;mso-position-vertical-relative:page;mso-width-percent:0;mso-height-percent:0;mso-width-relative:margin;mso-height-relative:margin;v-text-anchor:top" o:gfxdata="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" stroked="f">
+              <v:shape id="กล่องข้อความ 2" o:spid="_x0000_s1026" type="#_x0000_t202" style="position:absolute;margin-left:292.55pt;margin-top:505pt;width:217.7pt;height:275pt;z-index:251679744;visibility:visible;mso-wrap-style:square;mso-width-percent:0;mso-height-percent:0;mso-wrap-distance-left:9pt;mso-wrap-distance-top:3.6pt;mso-wrap-distance-right:9pt;mso-wrap-distance-bottom:3.6pt;mso-position-horizontal:absolute;mso-position-horizontal-relative:margin;mso-position-vertical:absolute;mso-position-vertical-relative:page;mso-width-percent:0;mso-height-percent:0;mso-width-relative:margin;mso-height-relative:margin;v-text-anchor:top" o:gfxdata="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" stroked="f">
                 <o:lock v:ext="edit" aspectratio="t"/>
                 <v:textbox>
                   <w:txbxContent>

</xml_diff>

<commit_message>
Reformat UI files and refine validation text
Applies a large formatting cleanup to `style.css` and `academic/admin/doc_fragments/5.html` (spacing, line breaks, selector formatting) without changing behavior. Updates the applicant document 2 warning text to require at least one teaching-evaluation attachment with clearer wording. Also refreshes the `doc_7.docx` template.
</commit_message>
<xml_diff>
--- a/HRCP-KKU-Academic/src/main/resources/templates/docx/doc_7.docx
+++ b/HRCP-KKU-Academic/src/main/resources/templates/docx/doc_7.docx
@@ -160,10 +160,26 @@
           <w:sz w:val="24"/>
           <w:szCs w:val="24"/>
         </w:rPr>
-        <w:t>{{applicant_name}}</w:t>
+        <w:t>{{</w:t>
       </w:r>
       <w:proofErr w:type="spellStart"/>
+      <w:r>
+        <w:rPr>
+          <w:rFonts w:ascii="TH Sarabun New" w:hAnsi="TH Sarabun New" w:cs="TH Sarabun New"/>
+          <w:sz w:val="24"/>
+          <w:szCs w:val="24"/>
+        </w:rPr>
+        <w:t>applicant_name</w:t>
+      </w:r>
       <w:proofErr w:type="spellEnd"/>
+      <w:r>
+        <w:rPr>
+          <w:rFonts w:ascii="TH Sarabun New" w:hAnsi="TH Sarabun New" w:cs="TH Sarabun New"/>
+          <w:sz w:val="24"/>
+          <w:szCs w:val="24"/>
+        </w:rPr>
+        <w:t>}}</w:t>
+      </w:r>
       <w:r>
         <w:rPr>
           <w:rFonts w:ascii="TH Sarabun New" w:hAnsi="TH Sarabun New" w:cs="TH Sarabun New"/>
@@ -196,10 +212,26 @@
           <w:sz w:val="24"/>
           <w:szCs w:val="24"/>
         </w:rPr>
-        <w:t>{{requested_position}}</w:t>
+        <w:t>{{</w:t>
       </w:r>
       <w:proofErr w:type="spellStart"/>
+      <w:r>
+        <w:rPr>
+          <w:rFonts w:ascii="TH Sarabun New" w:hAnsi="TH Sarabun New" w:cs="TH Sarabun New"/>
+          <w:sz w:val="24"/>
+          <w:szCs w:val="24"/>
+        </w:rPr>
+        <w:t>requested_position</w:t>
+      </w:r>
       <w:proofErr w:type="spellEnd"/>
+      <w:r>
+        <w:rPr>
+          <w:rFonts w:ascii="TH Sarabun New" w:hAnsi="TH Sarabun New" w:cs="TH Sarabun New"/>
+          <w:sz w:val="24"/>
+          <w:szCs w:val="24"/>
+        </w:rPr>
+        <w:t>}}</w:t>
+      </w:r>
     </w:p>
     <w:p>
       <w:pPr>
@@ -326,6 +358,7 @@
       </w:tblGrid>
       <w:tr>
         <w:trPr>
+          <w:cantSplit/>
           <w:trHeight w:val="303"/>
           <w:tblHeader/>
           <w:jc w:val="center"/>
@@ -1112,7 +1145,6 @@
           <w:p>
             <w:pPr>
               <w:spacing w:after="0"/>
-              <w:jc w:val="thaiDistribute"/>
               <w:rPr>
                 <w:rFonts w:ascii="TH Sarabun New" w:hAnsi="TH Sarabun New" w:cs="TH Sarabun New"/>
                 <w:sz w:val="24"/>
@@ -1383,7 +1415,6 @@
           <w:p>
             <w:pPr>
               <w:spacing w:after="0"/>
-              <w:jc w:val="thaiDistribute"/>
               <w:rPr>
                 <w:rFonts w:ascii="TH Sarabun New" w:hAnsi="TH Sarabun New" w:cs="TH Sarabun New"/>
                 <w:sz w:val="24"/>
@@ -1414,7 +1445,6 @@
           <w:p>
             <w:pPr>
               <w:spacing w:after="0"/>
-              <w:jc w:val="thaiDistribute"/>
               <w:rPr>
                 <w:rFonts w:ascii="TH Sarabun New" w:hAnsi="TH Sarabun New" w:cs="TH Sarabun New"/>
                 <w:sz w:val="24"/>
@@ -1452,7 +1482,6 @@
           <w:p>
             <w:pPr>
               <w:spacing w:after="0"/>
-              <w:jc w:val="thaiDistribute"/>
               <w:rPr>
                 <w:rFonts w:ascii="TH Sarabun New" w:hAnsi="TH Sarabun New" w:cs="TH Sarabun New"/>
                 <w:sz w:val="24"/>
@@ -1490,7 +1519,6 @@
           <w:p>
             <w:pPr>
               <w:spacing w:after="0"/>
-              <w:jc w:val="thaiDistribute"/>
               <w:rPr>
                 <w:rFonts w:ascii="TH Sarabun New" w:hAnsi="TH Sarabun New" w:cs="TH Sarabun New"/>
                 <w:sz w:val="24"/>
@@ -1510,7 +1538,6 @@
           <w:p>
             <w:pPr>
               <w:spacing w:after="0"/>
-              <w:jc w:val="thaiDistribute"/>
               <w:rPr>
                 <w:rFonts w:ascii="TH Sarabun New" w:hAnsi="TH Sarabun New" w:cs="TH Sarabun New"/>
                 <w:sz w:val="24"/>
@@ -1548,7 +1575,6 @@
           <w:p>
             <w:pPr>
               <w:spacing w:after="0"/>
-              <w:jc w:val="thaiDistribute"/>
               <w:rPr>
                 <w:rFonts w:ascii="TH Sarabun New" w:hAnsi="TH Sarabun New" w:cs="TH Sarabun New"/>
                 <w:sz w:val="24"/>
@@ -1763,7 +1789,6 @@
           <w:p>
             <w:pPr>
               <w:spacing w:after="0"/>
-              <w:jc w:val="thaiDistribute"/>
               <w:rPr>
                 <w:rFonts w:ascii="TH Sarabun New" w:hAnsi="TH Sarabun New" w:cs="TH Sarabun New"/>
                 <w:sz w:val="20"/>
@@ -1804,47 +1829,7 @@
                 <w:szCs w:val="20"/>
                 <w:cs/>
               </w:rPr>
-              <w:t xml:space="preserve"> เช่น </w:t>
-            </w:r>
-            <w:proofErr w:type="spellStart"/>
-            <w:r>
-              <w:rPr>
-                <w:rFonts w:ascii="TH Sarabun New" w:hAnsi="TH Sarabun New" w:cs="TH Sarabun New"/>
-                <w:sz w:val="20"/>
-                <w:szCs w:val="20"/>
-                <w:cs/>
-              </w:rPr>
-              <w:t>มคอ</w:t>
-            </w:r>
-            <w:proofErr w:type="spellEnd"/>
-            <w:r>
-              <w:rPr>
-                <w:rFonts w:ascii="TH Sarabun New" w:hAnsi="TH Sarabun New" w:cs="TH Sarabun New"/>
-                <w:sz w:val="20"/>
-                <w:szCs w:val="20"/>
-                <w:cs/>
-              </w:rPr>
-              <w:t xml:space="preserve">. ๓ </w:t>
-            </w:r>
-            <w:proofErr w:type="spellStart"/>
-            <w:r>
-              <w:rPr>
-                <w:rFonts w:ascii="TH Sarabun New" w:hAnsi="TH Sarabun New" w:cs="TH Sarabun New"/>
-                <w:sz w:val="20"/>
-                <w:szCs w:val="20"/>
-                <w:cs/>
-              </w:rPr>
-              <w:t>มคอ</w:t>
-            </w:r>
-            <w:proofErr w:type="spellEnd"/>
-            <w:r>
-              <w:rPr>
-                <w:rFonts w:ascii="TH Sarabun New" w:hAnsi="TH Sarabun New" w:cs="TH Sarabun New"/>
-                <w:sz w:val="20"/>
-                <w:szCs w:val="20"/>
-                <w:cs/>
-              </w:rPr>
-              <w:t>.๕</w:t>
+              <w:t xml:space="preserve"> เช่น มคอ. ๓ มคอ.๕</w:t>
             </w:r>
             <w:r>
               <w:rPr>
@@ -1868,7 +1853,6 @@
           <w:p>
             <w:pPr>
               <w:spacing w:after="0"/>
-              <w:jc w:val="thaiDistribute"/>
               <w:rPr>
                 <w:rFonts w:ascii="TH Sarabun New" w:hAnsi="TH Sarabun New" w:cs="TH Sarabun New"/>
                 <w:sz w:val="20"/>
@@ -2032,13 +2016,12 @@
                 <w:szCs w:val="24"/>
                 <w:cs/>
               </w:rPr>
-              <w:t xml:space="preserve">)                     </w:t>
-            </w:r>
-          </w:p>
-          <w:p>
-            <w:pPr>
-              <w:spacing w:after="0"/>
-              <w:jc w:val="thaiDistribute"/>
+              <w:t>)</w:t>
+            </w:r>
+          </w:p>
+          <w:p>
+            <w:pPr>
+              <w:spacing w:after="0"/>
               <w:rPr>
                 <w:rFonts w:ascii="TH Sarabun New" w:hAnsi="TH Sarabun New" w:cs="TH Sarabun New"/>
                 <w:sz w:val="24"/>
@@ -2062,14 +2045,24 @@
               </w:rPr>
               <w:t>Digital interactive media)</w:t>
             </w:r>
-            <w:r>
-              <w:rPr>
-                <w:rFonts w:ascii="TH Sarabun New" w:hAnsi="TH Sarabun New" w:cs="TH Sarabun New"/>
-                <w:sz w:val="24"/>
-                <w:szCs w:val="24"/>
-                <w:cs/>
-              </w:rPr>
-              <w:t xml:space="preserve">                                                                      ๒) มีความสามารถที่จะสอนให้ผู้เรียนสามารถเสาะแสวงหาความรู้และพัฒนาองค์ความรู้ได้ด้วยตนเอง ด้วยความ มีวิจารณญาณ รู้ว่าแหล่งความรู้ใดที่ควรเชื่อถือ สามารถเป็นผู้เรียนรู้อย่างต่อเนื่องตลอดชีวิต </w:t>
+          </w:p>
+          <w:p>
+            <w:pPr>
+              <w:spacing w:after="0"/>
+              <w:rPr>
+                <w:rFonts w:ascii="TH Sarabun New" w:hAnsi="TH Sarabun New" w:cs="TH Sarabun New"/>
+                <w:sz w:val="24"/>
+                <w:szCs w:val="24"/>
+              </w:rPr>
+            </w:pPr>
+            <w:r>
+              <w:rPr>
+                <w:rFonts w:ascii="TH Sarabun New" w:hAnsi="TH Sarabun New" w:cs="TH Sarabun New"/>
+                <w:sz w:val="24"/>
+                <w:szCs w:val="24"/>
+                <w:cs/>
+              </w:rPr>
+              <w:t>๒) มีความสามารถที่จะสอนให้ผู้เรียนสามารถเสาะแสวงหาความรู้และพัฒนาองค์ความรู้ได้ด้วยตนเอง ด้วยความ มีวิจารณญาณ รู้ว่าแหล่ง</w:t>
             </w:r>
             <w:r>
               <w:rPr>
@@ -2079,7 +2072,7 @@
                 <w:cs/>
               </w:rPr>
               <w:lastRenderedPageBreak/>
-              <w:t>(</w:t>
+              <w:t>ความรู้ใดที่ควรเชื่อถือ สามารถเป็นผู้เรียนรู้อย่างต่อเนื่องตลอดชีวิต (</w:t>
             </w:r>
             <w:r>
               <w:rPr>
@@ -2089,14 +2082,24 @@
               </w:rPr>
               <w:t>Lifelong learner)</w:t>
             </w:r>
-            <w:r>
-              <w:rPr>
-                <w:rFonts w:ascii="TH Sarabun New" w:hAnsi="TH Sarabun New" w:cs="TH Sarabun New"/>
-                <w:sz w:val="24"/>
-                <w:szCs w:val="24"/>
-                <w:cs/>
-              </w:rPr>
-              <w:t xml:space="preserve">                                                         ๓) มีความสามารถสอนให้ผู้เรียนคิด วิเคราะห์ และสังเคราะห์ความรู้อย่างมีเหตุผลในหัวข้อที่สอน                                                                                                         </w:t>
+          </w:p>
+          <w:p>
+            <w:pPr>
+              <w:spacing w:after="0"/>
+              <w:rPr>
+                <w:rFonts w:ascii="TH Sarabun New" w:hAnsi="TH Sarabun New" w:cs="TH Sarabun New"/>
+                <w:sz w:val="24"/>
+                <w:szCs w:val="24"/>
+              </w:rPr>
+            </w:pPr>
+            <w:r>
+              <w:rPr>
+                <w:rFonts w:ascii="TH Sarabun New" w:hAnsi="TH Sarabun New" w:cs="TH Sarabun New"/>
+                <w:sz w:val="24"/>
+                <w:szCs w:val="24"/>
+                <w:cs/>
+              </w:rPr>
+              <w:t xml:space="preserve">๓) มีความสามารถสอนให้ผู้เรียนคิด วิเคราะห์ และสังเคราะห์ความรู้อย่างมีเหตุผลในหัวข้อที่สอน                                                                                                       </w:t>
             </w:r>
             <w:r>
               <w:rPr>
@@ -2174,7 +2177,6 @@
           <w:p>
             <w:pPr>
               <w:spacing w:after="0"/>
-              <w:jc w:val="thaiDistribute"/>
               <w:rPr>
                 <w:rFonts w:ascii="TH Sarabun New" w:hAnsi="TH Sarabun New" w:cs="TH Sarabun New"/>
                 <w:sz w:val="24"/>
@@ -2461,7 +2463,6 @@
           <w:p>
             <w:pPr>
               <w:spacing w:after="0"/>
-              <w:jc w:val="thaiDistribute"/>
               <w:rPr>
                 <w:rFonts w:ascii="TH Sarabun New" w:hAnsi="TH Sarabun New" w:cs="TH Sarabun New"/>
                 <w:sz w:val="20"/>
@@ -2499,7 +2500,6 @@
           <w:p>
             <w:pPr>
               <w:spacing w:after="0"/>
-              <w:jc w:val="thaiDistribute"/>
               <w:rPr>
                 <w:rFonts w:ascii="TH Sarabun New" w:hAnsi="TH Sarabun New" w:cs="TH Sarabun New"/>
                 <w:sz w:val="20"/>
@@ -2669,7 +2669,6 @@
           <w:p>
             <w:pPr>
               <w:spacing w:after="0"/>
-              <w:jc w:val="thaiDistribute"/>
               <w:rPr>
                 <w:rFonts w:ascii="TH Sarabun New" w:hAnsi="TH Sarabun New" w:cs="TH Sarabun New"/>
                 <w:sz w:val="24"/>
@@ -2689,7 +2688,6 @@
           <w:p>
             <w:pPr>
               <w:spacing w:after="0"/>
-              <w:jc w:val="thaiDistribute"/>
               <w:rPr>
                 <w:rFonts w:ascii="TH Sarabun New" w:hAnsi="TH Sarabun New" w:cs="TH Sarabun New"/>
                 <w:sz w:val="24"/>
@@ -2910,7 +2908,6 @@
           <w:p>
             <w:pPr>
               <w:spacing w:after="0"/>
-              <w:jc w:val="thaiDistribute"/>
               <w:rPr>
                 <w:rFonts w:ascii="TH Sarabun New" w:hAnsi="TH Sarabun New" w:cs="TH Sarabun New"/>
                 <w:sz w:val="20"/>
@@ -2948,7 +2945,6 @@
           <w:p>
             <w:pPr>
               <w:spacing w:after="0"/>
-              <w:jc w:val="thaiDistribute"/>
               <w:rPr>
                 <w:rFonts w:ascii="TH Sarabun New" w:hAnsi="TH Sarabun New" w:cs="TH Sarabun New"/>
                 <w:sz w:val="20"/>
@@ -3188,7 +3184,25 @@
                 <w:sz w:val="24"/>
                 <w:szCs w:val="24"/>
               </w:rPr>
-              <w:t>{{scorex}}</w:t>
+              <w:t>{{</w:t>
+            </w:r>
+            <w:proofErr w:type="spellStart"/>
+            <w:r>
+              <w:rPr>
+                <w:rFonts w:ascii="TH Sarabun New" w:hAnsi="TH Sarabun New" w:cs="TH Sarabun New"/>
+                <w:sz w:val="24"/>
+                <w:szCs w:val="24"/>
+              </w:rPr>
+              <w:t>scorex</w:t>
+            </w:r>
+            <w:proofErr w:type="spellEnd"/>
+            <w:r>
+              <w:rPr>
+                <w:rFonts w:ascii="TH Sarabun New" w:hAnsi="TH Sarabun New" w:cs="TH Sarabun New"/>
+                <w:sz w:val="24"/>
+                <w:szCs w:val="24"/>
+              </w:rPr>
+              <w:t>}}</w:t>
             </w:r>
           </w:p>
         </w:tc>
@@ -3218,7 +3232,6 @@
     <w:p>
       <w:pPr>
         <w:spacing w:before="240" w:after="0"/>
-        <w:jc w:val="thaiDistribute"/>
         <w:rPr>
           <w:rFonts w:ascii="TH Sarabun New" w:hAnsi="TH Sarabun New" w:cs="TH Sarabun New"/>
           <w:szCs w:val="22"/>
@@ -3276,15 +3289,7 @@
           <w:szCs w:val="22"/>
           <w:cs/>
         </w:rPr>
-        <w:t xml:space="preserve">    </w:t>
-      </w:r>
-      <w:r>
-        <w:rPr>
-          <w:rFonts w:ascii="TH Sarabun New" w:hAnsi="TH Sarabun New" w:cs="TH Sarabun New"/>
-          <w:szCs w:val="22"/>
-          <w:cs/>
-        </w:rPr>
-        <w:t xml:space="preserve">  </w:t>
+        <w:t xml:space="preserve">      </w:t>
       </w:r>
       <w:r>
         <w:rPr>
@@ -3323,22 +3328,23 @@
           <w:szCs w:val="20"/>
           <w:cs/>
         </w:rPr>
-        <w:t xml:space="preserve"> ไม่ผ่าน</w:t>
-      </w:r>
-      <w:r>
-        <w:rPr>
-          <w:rFonts w:ascii="TH Sarabun New" w:hAnsi="TH Sarabun New" w:cs="TH Sarabun New"/>
-          <w:sz w:val="20"/>
-          <w:szCs w:val="20"/>
-        </w:rPr>
         <w:t xml:space="preserve"> </w:t>
       </w:r>
-      <w:r>
-        <w:rPr>
-          <w:rFonts w:ascii="TH Sarabun New" w:hAnsi="TH Sarabun New" w:cs="TH Sarabun New"/>
-          <w:sz w:val="20"/>
-          <w:szCs w:val="20"/>
-          <w:cs/>
+      <w:proofErr w:type="gramStart"/>
+      <w:r>
+        <w:rPr>
+          <w:rFonts w:ascii="TH Sarabun New" w:hAnsi="TH Sarabun New" w:cs="TH Sarabun New"/>
+          <w:sz w:val="20"/>
+          <w:szCs w:val="20"/>
+          <w:cs/>
+        </w:rPr>
+        <w:t>ไม่ผ่าน</w:t>
+      </w:r>
+      <w:r>
+        <w:rPr>
+          <w:rFonts w:ascii="TH Sarabun New" w:hAnsi="TH Sarabun New" w:cs="TH Sarabun New"/>
+          <w:sz w:val="20"/>
+          <w:szCs w:val="20"/>
         </w:rPr>
         <w:t xml:space="preserve"> </w:t>
       </w:r>
@@ -3347,25 +3353,62 @@
           <w:rFonts w:ascii="TH Sarabun New" w:hAnsi="TH Sarabun New" w:cs="TH Sarabun New"/>
           <w:sz w:val="20"/>
           <w:szCs w:val="20"/>
-        </w:rPr>
-        <w:t>{{ch2}}</w:t>
-      </w:r>
-      <w:r>
-        <w:rPr>
-          <w:rFonts w:ascii="TH Sarabun New" w:hAnsi="TH Sarabun New" w:cs="TH Sarabun New"/>
-          <w:sz w:val="20"/>
-          <w:szCs w:val="20"/>
-          <w:cs/>
-        </w:rPr>
-        <w:t xml:space="preserve"> ชำนาญ  </w:t>
-      </w:r>
-      <w:r>
-        <w:rPr>
-          <w:rFonts w:ascii="TH Sarabun New" w:hAnsi="TH Sarabun New" w:cs="TH Sarabun New"/>
-          <w:sz w:val="20"/>
-          <w:szCs w:val="20"/>
-        </w:rPr>
-        <w:t>{{ch3}}</w:t>
+          <w:cs/>
+        </w:rPr>
+        <w:t xml:space="preserve"> </w:t>
+      </w:r>
+      <w:r>
+        <w:rPr>
+          <w:rFonts w:ascii="TH Sarabun New" w:hAnsi="TH Sarabun New" w:cs="TH Sarabun New"/>
+          <w:sz w:val="20"/>
+          <w:szCs w:val="20"/>
+        </w:rPr>
+        <w:t>{</w:t>
+      </w:r>
+      <w:proofErr w:type="gramEnd"/>
+      <w:r>
+        <w:rPr>
+          <w:rFonts w:ascii="TH Sarabun New" w:hAnsi="TH Sarabun New" w:cs="TH Sarabun New"/>
+          <w:sz w:val="20"/>
+          <w:szCs w:val="20"/>
+        </w:rPr>
+        <w:t>{ch2}}</w:t>
+      </w:r>
+      <w:r>
+        <w:rPr>
+          <w:rFonts w:ascii="TH Sarabun New" w:hAnsi="TH Sarabun New" w:cs="TH Sarabun New"/>
+          <w:sz w:val="20"/>
+          <w:szCs w:val="20"/>
+          <w:cs/>
+        </w:rPr>
+        <w:t xml:space="preserve"> </w:t>
+      </w:r>
+      <w:proofErr w:type="gramStart"/>
+      <w:r>
+        <w:rPr>
+          <w:rFonts w:ascii="TH Sarabun New" w:hAnsi="TH Sarabun New" w:cs="TH Sarabun New"/>
+          <w:sz w:val="20"/>
+          <w:szCs w:val="20"/>
+          <w:cs/>
+        </w:rPr>
+        <w:t xml:space="preserve">ชำนาญ  </w:t>
+      </w:r>
+      <w:r>
+        <w:rPr>
+          <w:rFonts w:ascii="TH Sarabun New" w:hAnsi="TH Sarabun New" w:cs="TH Sarabun New"/>
+          <w:sz w:val="20"/>
+          <w:szCs w:val="20"/>
+        </w:rPr>
+        <w:t>{</w:t>
+      </w:r>
+      <w:proofErr w:type="gramEnd"/>
+      <w:r>
+        <w:rPr>
+          <w:rFonts w:ascii="TH Sarabun New" w:hAnsi="TH Sarabun New" w:cs="TH Sarabun New"/>
+          <w:sz w:val="20"/>
+          <w:szCs w:val="20"/>
+        </w:rPr>
+        <w:t>{ch3}}</w:t>
       </w:r>
       <w:r>
         <w:rPr>
@@ -3382,7 +3425,16 @@
           <w:sz w:val="20"/>
           <w:szCs w:val="20"/>
         </w:rPr>
-        <w:t>{{ch4}}</w:t>
+        <w:t>{{ch4</w:t>
+      </w:r>
+      <w:proofErr w:type="gramStart"/>
+      <w:r>
+        <w:rPr>
+          <w:rFonts w:ascii="TH Sarabun New" w:hAnsi="TH Sarabun New" w:cs="TH Sarabun New"/>
+          <w:sz w:val="20"/>
+          <w:szCs w:val="20"/>
+        </w:rPr>
+        <w:t>}}</w:t>
       </w:r>
       <w:r>
         <w:rPr>
@@ -3393,13 +3445,13 @@
         </w:rPr>
         <w:t>เชี่ยวชาญ</w:t>
       </w:r>
+      <w:proofErr w:type="gramEnd"/>
     </w:p>
     <w:p>
       <w:pPr>
         <w:spacing w:after="0"/>
-        <w:jc w:val="thaiDistribute"/>
-        <w:rPr>
-          <w:rFonts w:ascii="TH Sarabun New" w:hAnsi="TH Sarabun New" w:cs="TH Sarabun New"/>
+        <w:rPr>
+          <w:rFonts w:ascii="TH Sarabun New" w:hAnsi="TH Sarabun New" w:cs="TH Sarabun New" w:hint="cs"/>
           <w:sz w:val="20"/>
           <w:szCs w:val="20"/>
           <w:cs/>
@@ -3449,7 +3501,7 @@
       </w:r>
       <w:r>
         <w:rPr>
-          <w:rFonts w:ascii="TH Sarabun New" w:hAnsi="TH Sarabun New" w:cs="TH Sarabun New"/>
+          <w:rFonts w:ascii="TH Sarabun New" w:hAnsi="TH Sarabun New" w:cs="TH Sarabun New" w:hint="cs"/>
           <w:sz w:val="20"/>
           <w:szCs w:val="20"/>
           <w:cs/>
@@ -3461,31 +3513,14 @@
           <w:rFonts w:ascii="TH Sarabun New" w:hAnsi="TH Sarabun New" w:cs="TH Sarabun New"/>
           <w:sz w:val="20"/>
           <w:szCs w:val="20"/>
-        </w:rPr>
-        <w:t xml:space="preserve">               </w:t>
-      </w:r>
-      <w:r>
-        <w:rPr>
-          <w:rFonts w:ascii="TH Sarabun New" w:hAnsi="TH Sarabun New" w:cs="TH Sarabun New"/>
-          <w:sz w:val="20"/>
-          <w:szCs w:val="20"/>
-        </w:rPr>
-        <w:tab/>
-      </w:r>
-      <w:r>
-        <w:rPr>
-          <w:rFonts w:ascii="TH Sarabun New" w:hAnsi="TH Sarabun New" w:cs="TH Sarabun New"/>
-          <w:sz w:val="20"/>
-          <w:szCs w:val="20"/>
-        </w:rPr>
-        <w:tab/>
+          <w:cs/>
+        </w:rPr>
         <w:t xml:space="preserve"> </w:t>
       </w:r>
     </w:p>
     <w:p>
       <w:pPr>
         <w:spacing w:after="0"/>
-        <w:jc w:val="thaiDistribute"/>
         <w:rPr>
           <w:rFonts w:ascii="TH Sarabun New" w:hAnsi="TH Sarabun New" w:cs="TH Sarabun New"/>
           <w:sz w:val="20"/>
@@ -3516,13 +3551,29 @@
           <w:sz w:val="20"/>
           <w:szCs w:val="20"/>
         </w:rPr>
-        <w:t>{{score2x}}</w:t>
-      </w:r>
-      <w:r>
-        <w:rPr>
-          <w:rFonts w:ascii="TH Sarabun New" w:hAnsi="TH Sarabun New" w:cs="TH Sarabun New"/>
-          <w:sz w:val="15"/>
-          <w:szCs w:val="15"/>
+        <w:t>{{score</w:t>
+      </w:r>
+      <w:r>
+        <w:rPr>
+          <w:rFonts w:ascii="TH Sarabun New" w:hAnsi="TH Sarabun New" w:cs="TH Sarabun New"/>
+          <w:sz w:val="20"/>
+          <w:szCs w:val="20"/>
+        </w:rPr>
+        <w:t>2</w:t>
+      </w:r>
+      <w:r>
+        <w:rPr>
+          <w:rFonts w:ascii="TH Sarabun New" w:hAnsi="TH Sarabun New" w:cs="TH Sarabun New"/>
+          <w:sz w:val="20"/>
+          <w:szCs w:val="20"/>
+        </w:rPr>
+        <w:t>x}}</w:t>
+      </w:r>
+      <w:r>
+        <w:rPr>
+          <w:rFonts w:ascii="TH Sarabun New" w:hAnsi="TH Sarabun New" w:cs="TH Sarabun New"/>
+          <w:sz w:val="20"/>
+          <w:szCs w:val="20"/>
         </w:rPr>
         <w:t xml:space="preserve"> </w:t>
       </w:r>
@@ -3534,6 +3585,181 @@
           <w:cs/>
         </w:rPr>
         <w:t>คะแนน</w:t>
+      </w:r>
+    </w:p>
+    <w:p>
+      <w:pPr>
+        <w:spacing w:after="0"/>
+        <w:rPr>
+          <w:rFonts w:ascii="TH Sarabun New" w:hAnsi="TH Sarabun New" w:cs="TH Sarabun New"/>
+          <w:sz w:val="20"/>
+          <w:szCs w:val="20"/>
+        </w:rPr>
+      </w:pPr>
+      <w:r>
+        <w:rPr>
+          <w:rFonts w:ascii="TH Sarabun New" w:hAnsi="TH Sarabun New" w:cs="TH Sarabun New"/>
+          <w:sz w:val="20"/>
+          <w:szCs w:val="20"/>
+          <w:cs/>
+        </w:rPr>
+        <w:t>๓. ความสามารถด้านการจัดการเรียนการสอน</w:t>
+      </w:r>
+      <w:r>
+        <w:rPr>
+          <w:rFonts w:ascii="TH Sarabun New" w:hAnsi="TH Sarabun New" w:cs="TH Sarabun New"/>
+          <w:sz w:val="20"/>
+          <w:szCs w:val="20"/>
+          <w:cs/>
+        </w:rPr>
+        <w:tab/>
+      </w:r>
+      <w:r>
+        <w:rPr>
+          <w:rFonts w:ascii="TH Sarabun New" w:hAnsi="TH Sarabun New" w:cs="TH Sarabun New"/>
+          <w:sz w:val="20"/>
+          <w:szCs w:val="20"/>
+          <w:cs/>
+        </w:rPr>
+        <w:tab/>
+      </w:r>
+      <w:r>
+        <w:rPr>
+          <w:rFonts w:ascii="TH Sarabun New" w:hAnsi="TH Sarabun New" w:cs="TH Sarabun New"/>
+          <w:sz w:val="20"/>
+          <w:szCs w:val="20"/>
+          <w:cs/>
+        </w:rPr>
+        <w:tab/>
+      </w:r>
+      <w:r>
+        <w:rPr>
+          <w:rFonts w:ascii="TH Sarabun New" w:hAnsi="TH Sarabun New" w:cs="TH Sarabun New"/>
+          <w:sz w:val="20"/>
+          <w:szCs w:val="20"/>
+        </w:rPr>
+        <w:t>{{score</w:t>
+      </w:r>
+      <w:r>
+        <w:rPr>
+          <w:rFonts w:ascii="TH Sarabun New" w:hAnsi="TH Sarabun New" w:cs="TH Sarabun New"/>
+          <w:sz w:val="20"/>
+          <w:szCs w:val="20"/>
+        </w:rPr>
+        <w:t>3</w:t>
+      </w:r>
+      <w:r>
+        <w:rPr>
+          <w:rFonts w:ascii="TH Sarabun New" w:hAnsi="TH Sarabun New" w:cs="TH Sarabun New"/>
+          <w:sz w:val="20"/>
+          <w:szCs w:val="20"/>
+        </w:rPr>
+        <w:t>x}}</w:t>
+      </w:r>
+      <w:r>
+        <w:rPr>
+          <w:rFonts w:ascii="TH Sarabun New" w:hAnsi="TH Sarabun New" w:cs="TH Sarabun New" w:hint="cs"/>
+          <w:sz w:val="20"/>
+          <w:szCs w:val="20"/>
+          <w:cs/>
+        </w:rPr>
+        <w:t xml:space="preserve"> </w:t>
+      </w:r>
+      <w:r>
+        <w:rPr>
+          <w:rFonts w:ascii="TH Sarabun New" w:hAnsi="TH Sarabun New" w:cs="TH Sarabun New"/>
+          <w:sz w:val="20"/>
+          <w:szCs w:val="20"/>
+          <w:cs/>
+        </w:rPr>
+        <w:t>คะแนน</w:t>
+      </w:r>
+    </w:p>
+    <w:p>
+      <w:pPr>
+        <w:spacing w:after="0"/>
+        <w:rPr>
+          <w:rFonts w:ascii="TH Sarabun New" w:hAnsi="TH Sarabun New" w:cs="TH Sarabun New"/>
+          <w:sz w:val="20"/>
+          <w:szCs w:val="20"/>
+          <w:cs/>
+        </w:rPr>
+      </w:pPr>
+      <w:r>
+        <w:rPr>
+          <w:rFonts w:ascii="TH Sarabun New" w:hAnsi="TH Sarabun New" w:cs="TH Sarabun New"/>
+          <w:sz w:val="20"/>
+          <w:szCs w:val="20"/>
+          <w:cs/>
+        </w:rPr>
+        <w:t>๔. ความเป็นผู้มีคุณธรรมจริยธรรม และวิญญาณความเป็นครู</w:t>
+      </w:r>
+      <w:r>
+        <w:rPr>
+          <w:rFonts w:ascii="TH Sarabun New" w:hAnsi="TH Sarabun New" w:cs="TH Sarabun New"/>
+          <w:sz w:val="20"/>
+          <w:szCs w:val="20"/>
+        </w:rPr>
+        <w:tab/>
+      </w:r>
+      <w:r>
+        <w:rPr>
+          <w:rFonts w:ascii="TH Sarabun New" w:hAnsi="TH Sarabun New" w:cs="TH Sarabun New"/>
+          <w:sz w:val="20"/>
+          <w:szCs w:val="20"/>
+        </w:rPr>
+        <w:tab/>
+      </w:r>
+      <w:r>
+        <w:rPr>
+          <w:rFonts w:ascii="TH Sarabun New" w:hAnsi="TH Sarabun New" w:cs="TH Sarabun New"/>
+          <w:sz w:val="20"/>
+          <w:szCs w:val="20"/>
+        </w:rPr>
+        <w:t>{{score</w:t>
+      </w:r>
+      <w:r>
+        <w:rPr>
+          <w:rFonts w:ascii="TH Sarabun New" w:hAnsi="TH Sarabun New" w:cs="TH Sarabun New"/>
+          <w:sz w:val="20"/>
+          <w:szCs w:val="20"/>
+        </w:rPr>
+        <w:t>4</w:t>
+      </w:r>
+      <w:r>
+        <w:rPr>
+          <w:rFonts w:ascii="TH Sarabun New" w:hAnsi="TH Sarabun New" w:cs="TH Sarabun New"/>
+          <w:sz w:val="20"/>
+          <w:szCs w:val="20"/>
+        </w:rPr>
+        <w:t>x}}</w:t>
+      </w:r>
+      <w:r>
+        <w:rPr>
+          <w:rFonts w:ascii="TH Sarabun New" w:hAnsi="TH Sarabun New" w:cs="TH Sarabun New" w:hint="cs"/>
+          <w:sz w:val="20"/>
+          <w:szCs w:val="20"/>
+          <w:cs/>
+        </w:rPr>
+        <w:t xml:space="preserve"> </w:t>
+      </w:r>
+      <w:r>
+        <w:rPr>
+          <w:rFonts w:ascii="TH Sarabun New" w:hAnsi="TH Sarabun New" w:cs="TH Sarabun New"/>
+          <w:sz w:val="20"/>
+          <w:szCs w:val="20"/>
+          <w:cs/>
+        </w:rPr>
+        <w:t xml:space="preserve">คะแนน </w:t>
+      </w:r>
+      <w:r>
+        <w:rPr>
+          <w:rFonts w:ascii="TH Sarabun New" w:hAnsi="TH Sarabun New" w:cs="TH Sarabun New"/>
+          <w:sz w:val="20"/>
+          <w:szCs w:val="20"/>
+          <w:cs/>
+        </w:rPr>
+        <w:tab/>
       </w:r>
     </w:p>
     <w:p>
@@ -3556,31 +3782,31 @@
         <mc:AlternateContent>
           <mc:Choice Requires="wps">
             <w:drawing>
-              <wp:anchor distT="45720" distB="45720" distL="114300" distR="114300" simplePos="0" relativeHeight="251679744" behindDoc="0" locked="1" layoutInCell="1" allowOverlap="1" wp14:anchorId="4A59BA1E" wp14:editId="754B840A">
+              <wp:anchor distT="45720" distB="45720" distL="114300" distR="114300" simplePos="0" relativeHeight="251681792" behindDoc="0" locked="0" layoutInCell="1" allowOverlap="1" wp14:anchorId="37782657" wp14:editId="1763A0BD">
                 <wp:simplePos x="0" y="0"/>
                 <wp:positionH relativeFrom="margin">
-                  <wp:posOffset>3715385</wp:posOffset>
+                  <wp:posOffset>3370997</wp:posOffset>
                 </wp:positionH>
-                <wp:positionV relativeFrom="page">
-                  <wp:posOffset>6413500</wp:posOffset>
+                <wp:positionV relativeFrom="paragraph">
+                  <wp:posOffset>182160</wp:posOffset>
                 </wp:positionV>
-                <wp:extent cx="2764800" cy="3492500"/>
-                <wp:effectExtent l="0" t="0" r="3810" b="0"/>
-                <wp:wrapSquare wrapText="bothSides"/>
-                <wp:docPr id="217" name="กล่องข้อความ 2"/>
+                <wp:extent cx="2763672" cy="1828800"/>
+                <wp:effectExtent l="0" t="0" r="0" b="0"/>
+                <wp:wrapNone/>
+                <wp:docPr id="1429186260" name="กล่องข้อความ 2"/>
                 <wp:cNvGraphicFramePr>
-                  <a:graphicFrameLocks xmlns:a="http://schemas.openxmlformats.org/drawingml/2006/main" noChangeAspect="1"/>
+                  <a:graphicFrameLocks xmlns:a="http://schemas.openxmlformats.org/drawingml/2006/main"/>
                 </wp:cNvGraphicFramePr>
                 <a:graphic xmlns:a="http://schemas.openxmlformats.org/drawingml/2006/main">
                   <a:graphicData uri="http://schemas.microsoft.com/office/word/2010/wordprocessingShape">
                     <wps:wsp>
                       <wps:cNvSpPr txBox="1">
-                        <a:spLocks noChangeAspect="1" noChangeArrowheads="1"/>
+                        <a:spLocks noChangeArrowheads="1"/>
                       </wps:cNvSpPr>
                       <wps:spPr bwMode="auto">
                         <a:xfrm>
                           <a:off x="0" y="0"/>
-                          <a:ext cx="2764800" cy="3492500"/>
+                          <a:ext cx="2763672" cy="1828800"/>
                         </a:xfrm>
                         <a:prstGeom prst="rect">
                           <a:avLst/>
@@ -3614,24 +3840,7 @@
                                 <w:szCs w:val="24"/>
                                 <w:cs/>
                               </w:rPr>
-                              <w:t>ลงชื่อ</w:t>
-                            </w:r>
-                            <w:r>
-                              <w:rPr>
-                                <w:rFonts w:ascii="TH Sarabun New" w:hAnsi="TH Sarabun New" w:cs="TH Sarabun New"/>
-                                <w:sz w:val="24"/>
-                                <w:szCs w:val="24"/>
-                              </w:rPr>
-                              <w:t>……………………………………………..</w:t>
-                            </w:r>
-                            <w:r>
-                              <w:rPr>
-                                <w:rFonts w:ascii="TH Sarabun New" w:hAnsi="TH Sarabun New" w:cs="TH Sarabun New"/>
-                                <w:sz w:val="24"/>
-                                <w:szCs w:val="24"/>
-                                <w:cs/>
-                              </w:rPr>
-                              <w:t>ประธานคณะกรรมการ</w:t>
+                              <w:t>ลงชื่อ.....................................................ประธานคณะกรรมการ</w:t>
                             </w:r>
                           </w:p>
                           <w:p>
@@ -3699,24 +3908,7 @@
                                 <w:szCs w:val="24"/>
                                 <w:cs/>
                               </w:rPr>
-                              <w:t>ชื่อ</w:t>
-                            </w:r>
-                            <w:r>
-                              <w:rPr>
-                                <w:rFonts w:ascii="TH Sarabun New" w:hAnsi="TH Sarabun New" w:cs="TH Sarabun New"/>
-                                <w:sz w:val="24"/>
-                                <w:szCs w:val="24"/>
-                              </w:rPr>
-                              <w:t>……………………………………………</w:t>
-                            </w:r>
-                            <w:r>
-                              <w:rPr>
-                                <w:rFonts w:ascii="TH Sarabun New" w:hAnsi="TH Sarabun New" w:cs="TH Sarabun New"/>
-                                <w:sz w:val="24"/>
-                                <w:szCs w:val="24"/>
-                                <w:cs/>
-                              </w:rPr>
-                              <w:t>กรรมการ</w:t>
+                              <w:t>ชื่อ...............................................กรรมการ</w:t>
                             </w:r>
                           </w:p>
                           <w:p>
@@ -3784,24 +3976,7 @@
                                 <w:szCs w:val="24"/>
                                 <w:cs/>
                               </w:rPr>
-                              <w:t>ชื่อ</w:t>
-                            </w:r>
-                            <w:r>
-                              <w:rPr>
-                                <w:rFonts w:ascii="TH Sarabun New" w:hAnsi="TH Sarabun New" w:cs="TH Sarabun New"/>
-                                <w:sz w:val="24"/>
-                                <w:szCs w:val="24"/>
-                              </w:rPr>
-                              <w:t>………………………………………….</w:t>
-                            </w:r>
-                            <w:r>
-                              <w:rPr>
-                                <w:rFonts w:ascii="TH Sarabun New" w:hAnsi="TH Sarabun New" w:cs="TH Sarabun New"/>
-                                <w:sz w:val="24"/>
-                                <w:szCs w:val="24"/>
-                                <w:cs/>
-                              </w:rPr>
-                              <w:t>กรรมการ</w:t>
+                              <w:t>ชื่อ...............................................กรรมการ</w:t>
                             </w:r>
                           </w:p>
                           <w:p>
@@ -3860,12 +4035,11 @@
           </mc:Choice>
           <mc:Fallback>
             <w:pict>
-              <v:shapetype w14:anchorId="4A59BA1E" id="_x0000_t202" coordsize="21600,21600" o:spt="202" path="m,l,21600r21600,l21600,xe">
+              <v:shapetype w14:anchorId="37782657" id="_x0000_t202" coordsize="21600,21600" o:spt="202" path="m,l,21600r21600,l21600,xe">
                 <v:stroke joinstyle="miter"/>
                 <v:path gradientshapeok="t" o:connecttype="rect"/>
               </v:shapetype>
-              <v:shape id="กล่องข้อความ 2" o:spid="_x0000_s1026" type="#_x0000_t202" style="position:absolute;margin-left:292.55pt;margin-top:505pt;width:217.7pt;height:275pt;z-index:251679744;visibility:visible;mso-wrap-style:square;mso-width-percent:0;mso-height-percent:0;mso-wrap-distance-left:9pt;mso-wrap-distance-top:3.6pt;mso-wrap-distance-right:9pt;mso-wrap-distance-bottom:3.6pt;mso-position-horizontal:absolute;mso-position-horizontal-relative:margin;mso-position-vertical:absolute;mso-position-vertical-relative:page;mso-width-percent:0;mso-height-percent:0;mso-width-relative:margin;mso-height-relative:margin;v-text-anchor:top" o:gfxdata="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" stroked="f">
-                <o:lock v:ext="edit" aspectratio="t"/>
+              <v:shape id="กล่องข้อความ 2" o:spid="_x0000_s1026" type="#_x0000_t202" style="position:absolute;margin-left:265.45pt;margin-top:14.35pt;width:217.6pt;height:2in;z-index:251681792;visibility:visible;mso-wrap-style:square;mso-width-percent:0;mso-height-percent:0;mso-wrap-distance-left:9pt;mso-wrap-distance-top:3.6pt;mso-wrap-distance-right:9pt;mso-wrap-distance-bottom:3.6pt;mso-position-horizontal:absolute;mso-position-horizontal-relative:margin;mso-position-vertical:absolute;mso-position-vertical-relative:text;mso-width-percent:0;mso-height-percent:0;mso-width-relative:margin;mso-height-relative:margin;v-text-anchor:top" o:gfxdata="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" stroked="f">
                 <v:textbox>
                   <w:txbxContent>
                     <w:p>
@@ -3885,24 +4059,7 @@
                           <w:szCs w:val="24"/>
                           <w:cs/>
                         </w:rPr>
-                        <w:t>ลงชื่อ</w:t>
-                      </w:r>
-                      <w:r>
-                        <w:rPr>
-                          <w:rFonts w:ascii="TH Sarabun New" w:hAnsi="TH Sarabun New" w:cs="TH Sarabun New"/>
-                          <w:sz w:val="24"/>
-                          <w:szCs w:val="24"/>
-                        </w:rPr>
-                        <w:t>……………………………………………..</w:t>
-                      </w:r>
-                      <w:r>
-                        <w:rPr>
-                          <w:rFonts w:ascii="TH Sarabun New" w:hAnsi="TH Sarabun New" w:cs="TH Sarabun New"/>
-                          <w:sz w:val="24"/>
-                          <w:szCs w:val="24"/>
-                          <w:cs/>
-                        </w:rPr>
-                        <w:t>ประธานคณะกรรมการ</w:t>
+                        <w:t>ลงชื่อ.....................................................ประธานคณะกรรมการ</w:t>
                       </w:r>
                     </w:p>
                     <w:p>
@@ -3970,24 +4127,7 @@
                           <w:szCs w:val="24"/>
                           <w:cs/>
                         </w:rPr>
-                        <w:t>ชื่อ</w:t>
-                      </w:r>
-                      <w:r>
-                        <w:rPr>
-                          <w:rFonts w:ascii="TH Sarabun New" w:hAnsi="TH Sarabun New" w:cs="TH Sarabun New"/>
-                          <w:sz w:val="24"/>
-                          <w:szCs w:val="24"/>
-                        </w:rPr>
-                        <w:t>……………………………………………</w:t>
-                      </w:r>
-                      <w:r>
-                        <w:rPr>
-                          <w:rFonts w:ascii="TH Sarabun New" w:hAnsi="TH Sarabun New" w:cs="TH Sarabun New"/>
-                          <w:sz w:val="24"/>
-                          <w:szCs w:val="24"/>
-                          <w:cs/>
-                        </w:rPr>
-                        <w:t>กรรมการ</w:t>
+                        <w:t>ชื่อ...............................................กรรมการ</w:t>
                       </w:r>
                     </w:p>
                     <w:p>
@@ -4015,7 +4155,23 @@
                           <w:sz w:val="24"/>
                           <w:szCs w:val="24"/>
                         </w:rPr>
-                        <w:t>{{committee_2_name}}</w:t>
+                        <w:t>{{committee_</w:t>
+                      </w:r>
+                      <w:r>
+                        <w:rPr>
+                          <w:rFonts w:ascii="TH Sarabun New" w:hAnsi="TH Sarabun New" w:cs="TH Sarabun New"/>
+                          <w:sz w:val="24"/>
+                          <w:szCs w:val="24"/>
+                        </w:rPr>
+                        <w:t>2</w:t>
+                      </w:r>
+                      <w:r>
+                        <w:rPr>
+                          <w:rFonts w:ascii="TH Sarabun New" w:hAnsi="TH Sarabun New" w:cs="TH Sarabun New"/>
+                          <w:sz w:val="24"/>
+                          <w:szCs w:val="24"/>
+                        </w:rPr>
+                        <w:t>_name}}</w:t>
                       </w:r>
                       <w:r>
                         <w:rPr>
@@ -4055,24 +4211,7 @@
                           <w:szCs w:val="24"/>
                           <w:cs/>
                         </w:rPr>
-                        <w:t>ชื่อ</w:t>
-                      </w:r>
-                      <w:r>
-                        <w:rPr>
-                          <w:rFonts w:ascii="TH Sarabun New" w:hAnsi="TH Sarabun New" w:cs="TH Sarabun New"/>
-                          <w:sz w:val="24"/>
-                          <w:szCs w:val="24"/>
-                        </w:rPr>
-                        <w:t>………………………………………….</w:t>
-                      </w:r>
-                      <w:r>
-                        <w:rPr>
-                          <w:rFonts w:ascii="TH Sarabun New" w:hAnsi="TH Sarabun New" w:cs="TH Sarabun New"/>
-                          <w:sz w:val="24"/>
-                          <w:szCs w:val="24"/>
-                          <w:cs/>
-                        </w:rPr>
-                        <w:t>กรรมการ</w:t>
+                        <w:t>ชื่อ...............................................กรรมการ</w:t>
                       </w:r>
                     </w:p>
                     <w:p>
@@ -4100,7 +4239,23 @@
                           <w:sz w:val="24"/>
                           <w:szCs w:val="24"/>
                         </w:rPr>
-                        <w:t>{{committee_3_name}}</w:t>
+                        <w:t>{{committee_</w:t>
+                      </w:r>
+                      <w:r>
+                        <w:rPr>
+                          <w:rFonts w:ascii="TH Sarabun New" w:hAnsi="TH Sarabun New" w:cs="TH Sarabun New"/>
+                          <w:sz w:val="24"/>
+                          <w:szCs w:val="24"/>
+                        </w:rPr>
+                        <w:t>3</w:t>
+                      </w:r>
+                      <w:r>
+                        <w:rPr>
+                          <w:rFonts w:ascii="TH Sarabun New" w:hAnsi="TH Sarabun New" w:cs="TH Sarabun New"/>
+                          <w:sz w:val="24"/>
+                          <w:szCs w:val="24"/>
+                        </w:rPr>
+                        <w:t>_name}}</w:t>
                       </w:r>
                       <w:r>
                         <w:rPr>
@@ -4114,8 +4269,7 @@
                     </w:p>
                   </w:txbxContent>
                 </v:textbox>
-                <w10:wrap type="square" anchorx="margin" anchory="page"/>
-                <w10:anchorlock/>
+                <w10:wrap anchorx="margin"/>
               </v:shape>
             </w:pict>
           </mc:Fallback>
@@ -4124,137 +4278,6 @@
       <w:r>
         <w:rPr>
           <w:rFonts w:ascii="TH Sarabun New" w:hAnsi="TH Sarabun New" w:cs="TH Sarabun New"/>
-          <w:sz w:val="20"/>
-          <w:szCs w:val="20"/>
-          <w:cs/>
-        </w:rPr>
-        <w:t>๓. ความสามารถด้านการจัดการเรียนการสอน</w:t>
-      </w:r>
-      <w:r>
-        <w:rPr>
-          <w:rFonts w:ascii="TH Sarabun New" w:hAnsi="TH Sarabun New" w:cs="TH Sarabun New"/>
-          <w:sz w:val="20"/>
-          <w:szCs w:val="20"/>
-        </w:rPr>
-        <w:tab/>
-      </w:r>
-      <w:r>
-        <w:rPr>
-          <w:rFonts w:ascii="TH Sarabun New" w:hAnsi="TH Sarabun New" w:cs="TH Sarabun New"/>
-          <w:sz w:val="20"/>
-          <w:szCs w:val="20"/>
-        </w:rPr>
-        <w:tab/>
-      </w:r>
-      <w:r>
-        <w:rPr>
-          <w:rFonts w:ascii="TH Sarabun New" w:hAnsi="TH Sarabun New" w:cs="TH Sarabun New"/>
-          <w:sz w:val="20"/>
-          <w:szCs w:val="20"/>
-        </w:rPr>
-        <w:tab/>
-      </w:r>
-      <w:r>
-        <w:rPr>
-          <w:rFonts w:ascii="TH Sarabun New" w:hAnsi="TH Sarabun New" w:cs="TH Sarabun New"/>
-          <w:sz w:val="20"/>
-          <w:szCs w:val="20"/>
-        </w:rPr>
-        <w:t>{{score3x}}</w:t>
-      </w:r>
-      <w:r>
-        <w:rPr>
-          <w:rFonts w:ascii="TH Sarabun New" w:hAnsi="TH Sarabun New" w:cs="TH Sarabun New" w:hint="cs"/>
-          <w:sz w:val="15"/>
-          <w:szCs w:val="15"/>
-          <w:cs/>
-        </w:rPr>
-        <w:t xml:space="preserve"> </w:t>
-      </w:r>
-      <w:r>
-        <w:rPr>
-          <w:rFonts w:ascii="TH Sarabun New" w:hAnsi="TH Sarabun New" w:cs="TH Sarabun New"/>
-          <w:sz w:val="20"/>
-          <w:szCs w:val="20"/>
-          <w:cs/>
-        </w:rPr>
-        <w:t>คะแนน</w:t>
-      </w:r>
-    </w:p>
-    <w:p>
-      <w:pPr>
-        <w:spacing w:after="0"/>
-        <w:jc w:val="thaiDistribute"/>
-        <w:rPr>
-          <w:rFonts w:ascii="TH Sarabun New" w:hAnsi="TH Sarabun New" w:cs="TH Sarabun New"/>
-          <w:sz w:val="20"/>
-          <w:szCs w:val="20"/>
-          <w:cs/>
-        </w:rPr>
-      </w:pPr>
-      <w:r>
-        <w:rPr>
-          <w:rFonts w:ascii="TH Sarabun New" w:hAnsi="TH Sarabun New" w:cs="TH Sarabun New"/>
-          <w:sz w:val="20"/>
-          <w:szCs w:val="20"/>
-          <w:cs/>
-        </w:rPr>
-        <w:t>๔. ความเป็นผู้มีคุณธรรมจริยธรรม และวิญญาณความเป็นครู</w:t>
-      </w:r>
-      <w:r>
-        <w:rPr>
-          <w:rFonts w:ascii="TH Sarabun New" w:hAnsi="TH Sarabun New" w:cs="TH Sarabun New"/>
-          <w:sz w:val="20"/>
-          <w:szCs w:val="20"/>
-        </w:rPr>
-        <w:tab/>
-      </w:r>
-      <w:r>
-        <w:rPr>
-          <w:rFonts w:ascii="TH Sarabun New" w:hAnsi="TH Sarabun New" w:cs="TH Sarabun New"/>
-          <w:sz w:val="20"/>
-          <w:szCs w:val="20"/>
-        </w:rPr>
-        <w:tab/>
-      </w:r>
-      <w:r>
-        <w:rPr>
-          <w:rFonts w:ascii="TH Sarabun New" w:hAnsi="TH Sarabun New" w:cs="TH Sarabun New"/>
-          <w:sz w:val="20"/>
-          <w:szCs w:val="20"/>
-        </w:rPr>
-        <w:t>{{score4x}}</w:t>
-      </w:r>
-      <w:r>
-        <w:rPr>
-          <w:rFonts w:ascii="TH Sarabun New" w:hAnsi="TH Sarabun New" w:cs="TH Sarabun New" w:hint="cs"/>
-          <w:sz w:val="15"/>
-          <w:szCs w:val="15"/>
-          <w:cs/>
-        </w:rPr>
-        <w:t xml:space="preserve"> </w:t>
-      </w:r>
-      <w:r>
-        <w:rPr>
-          <w:rFonts w:ascii="TH Sarabun New" w:hAnsi="TH Sarabun New" w:cs="TH Sarabun New"/>
-          <w:sz w:val="20"/>
-          <w:szCs w:val="20"/>
-          <w:cs/>
-        </w:rPr>
-        <w:t xml:space="preserve">คะแนน </w:t>
-      </w:r>
-    </w:p>
-    <w:p>
-      <w:pPr>
-        <w:rPr>
-          <w:rFonts w:ascii="TH Sarabun New" w:hAnsi="TH Sarabun New" w:cs="TH Sarabun New"/>
-          <w:sz w:val="20"/>
-          <w:szCs w:val="20"/>
-        </w:rPr>
-      </w:pPr>
-      <w:r>
-        <w:rPr>
-          <w:rFonts w:ascii="TH Sarabun New" w:hAnsi="TH Sarabun New" w:cs="TH Sarabun New"/>
           <w:b/>
           <w:bCs/>
           <w:sz w:val="20"/>
@@ -4279,6 +4302,7 @@
           <w:rFonts w:ascii="TH Sarabun New" w:hAnsi="TH Sarabun New" w:cs="TH Sarabun New"/>
           <w:sz w:val="20"/>
           <w:szCs w:val="20"/>
+          <w:cs/>
         </w:rPr>
         <w:tab/>
       </w:r>
@@ -4287,14 +4311,17 @@
           <w:rFonts w:ascii="TH Sarabun New" w:hAnsi="TH Sarabun New" w:cs="TH Sarabun New"/>
           <w:sz w:val="20"/>
           <w:szCs w:val="20"/>
+          <w:cs/>
         </w:rPr>
         <w:tab/>
-      </w:r>
-      <w:r>
-        <w:rPr>
-          <w:rFonts w:ascii="TH Sarabun New" w:hAnsi="TH Sarabun New" w:cs="TH Sarabun New"/>
-          <w:sz w:val="20"/>
-          <w:szCs w:val="20"/>
+        <w:t xml:space="preserve">    </w:t>
+      </w:r>
+      <w:r>
+        <w:rPr>
+          <w:rFonts w:ascii="TH Sarabun New" w:hAnsi="TH Sarabun New" w:cs="TH Sarabun New"/>
+          <w:sz w:val="20"/>
+          <w:szCs w:val="20"/>
+          <w:cs/>
         </w:rPr>
         <w:tab/>
       </w:r>
@@ -4303,6 +4330,7 @@
           <w:rFonts w:ascii="TH Sarabun New" w:hAnsi="TH Sarabun New" w:cs="TH Sarabun New"/>
           <w:sz w:val="20"/>
           <w:szCs w:val="20"/>
+          <w:cs/>
         </w:rPr>
         <w:tab/>
       </w:r>
@@ -4312,13 +4340,31 @@
           <w:sz w:val="20"/>
           <w:szCs w:val="20"/>
         </w:rPr>
-        <w:t>{{scorex}}</w:t>
-      </w:r>
-      <w:r>
-        <w:rPr>
-          <w:rFonts w:ascii="TH Sarabun New" w:hAnsi="TH Sarabun New" w:cs="TH Sarabun New"/>
-          <w:sz w:val="15"/>
-          <w:szCs w:val="15"/>
+        <w:t>{{</w:t>
+      </w:r>
+      <w:proofErr w:type="spellStart"/>
+      <w:r>
+        <w:rPr>
+          <w:rFonts w:ascii="TH Sarabun New" w:hAnsi="TH Sarabun New" w:cs="TH Sarabun New"/>
+          <w:sz w:val="20"/>
+          <w:szCs w:val="20"/>
+        </w:rPr>
+        <w:t>scorex</w:t>
+      </w:r>
+      <w:proofErr w:type="spellEnd"/>
+      <w:r>
+        <w:rPr>
+          <w:rFonts w:ascii="TH Sarabun New" w:hAnsi="TH Sarabun New" w:cs="TH Sarabun New"/>
+          <w:sz w:val="20"/>
+          <w:szCs w:val="20"/>
+        </w:rPr>
+        <w:t>}}</w:t>
+      </w:r>
+      <w:r>
+        <w:rPr>
+          <w:rFonts w:ascii="TH Sarabun New" w:hAnsi="TH Sarabun New" w:cs="TH Sarabun New" w:hint="cs"/>
+          <w:sz w:val="20"/>
+          <w:szCs w:val="20"/>
           <w:cs/>
         </w:rPr>
         <w:t xml:space="preserve"> </w:t>
@@ -4326,28 +4372,20 @@
       <w:r>
         <w:rPr>
           <w:rFonts w:ascii="TH Sarabun New" w:hAnsi="TH Sarabun New" w:cs="TH Sarabun New"/>
-          <w:sz w:val="15"/>
-          <w:szCs w:val="15"/>
-        </w:rPr>
-        <w:t xml:space="preserve"> </w:t>
-      </w:r>
-      <w:r>
-        <w:rPr>
-          <w:rFonts w:ascii="TH Sarabun New" w:hAnsi="TH Sarabun New" w:cs="TH Sarabun New" w:hint="cs"/>
-          <w:sz w:val="15"/>
-          <w:szCs w:val="15"/>
-          <w:cs/>
-        </w:rPr>
-        <w:t xml:space="preserve"> </w:t>
-      </w:r>
-      <w:r>
-        <w:rPr>
-          <w:rFonts w:ascii="TH Sarabun New" w:hAnsi="TH Sarabun New" w:cs="TH Sarabun New"/>
           <w:sz w:val="20"/>
           <w:szCs w:val="20"/>
           <w:cs/>
         </w:rPr>
         <w:t>คะแนน</w:t>
+      </w:r>
+      <w:r>
+        <w:rPr>
+          <w:rFonts w:ascii="TH Sarabun New" w:hAnsi="TH Sarabun New" w:cs="TH Sarabun New"/>
+          <w:sz w:val="20"/>
+          <w:szCs w:val="20"/>
+        </w:rPr>
+        <w:tab/>
+        <w:t xml:space="preserve">      </w:t>
       </w:r>
     </w:p>
     <w:p>
@@ -4372,21 +4410,10 @@
         </w:rPr>
         <w:t>เกณฑ์การประเมิน</w:t>
       </w:r>
-      <w:r>
-        <w:rPr>
-          <w:rFonts w:ascii="TH Sarabun New" w:hAnsi="TH Sarabun New" w:cs="TH Sarabun New"/>
-          <w:b/>
-          <w:bCs/>
-          <w:sz w:val="24"/>
-          <w:szCs w:val="24"/>
-        </w:rPr>
-        <w:t xml:space="preserve">                                                                                                 </w:t>
-      </w:r>
     </w:p>
     <w:p>
       <w:pPr>
         <w:spacing w:after="0"/>
-        <w:jc w:val="thaiDistribute"/>
         <w:rPr>
           <w:rFonts w:ascii="TH Sarabun New" w:hAnsi="TH Sarabun New" w:cs="TH Sarabun New"/>
           <w:sz w:val="20"/>
@@ -4418,50 +4445,49 @@
           <w:szCs w:val="20"/>
         </w:rPr>
         <w:tab/>
+        <w:t xml:space="preserve">  </w:t>
       </w:r>
     </w:p>
     <w:p>
       <w:pPr>
         <w:spacing w:after="0"/>
-        <w:jc w:val="thaiDistribute"/>
-        <w:rPr>
-          <w:rFonts w:ascii="TH Sarabun New" w:hAnsi="TH Sarabun New" w:cs="TH Sarabun New"/>
-          <w:sz w:val="20"/>
-          <w:szCs w:val="20"/>
-          <w:cs/>
-        </w:rPr>
-      </w:pPr>
-      <w:r>
-        <w:rPr>
-          <w:rFonts w:ascii="TH Sarabun New" w:hAnsi="TH Sarabun New" w:cs="TH Sarabun New"/>
-          <w:sz w:val="20"/>
-          <w:szCs w:val="20"/>
-          <w:cs/>
-        </w:rPr>
-        <w:t>ผลรวมค่าน้ำหนักคะแนนที่ได้ เท่ากับ ๕๗-๗๐ ให้ถือว่าผลการสอนอยู่ในระดับ ชำนาญ</w:t>
-      </w:r>
-      <w:r>
-        <w:rPr>
-          <w:rFonts w:ascii="TH Sarabun New" w:hAnsi="TH Sarabun New" w:cs="TH Sarabun New" w:hint="cs"/>
-          <w:sz w:val="20"/>
-          <w:szCs w:val="20"/>
-          <w:cs/>
-        </w:rPr>
-        <w:t xml:space="preserve">                               </w:t>
-      </w:r>
-      <w:r>
-        <w:rPr>
-          <w:rFonts w:ascii="TH Sarabun New" w:hAnsi="TH Sarabun New" w:cs="TH Sarabun New"/>
-          <w:sz w:val="20"/>
-          <w:szCs w:val="20"/>
-        </w:rPr>
-        <w:t xml:space="preserve">                     </w:t>
+        <w:rPr>
+          <w:rFonts w:ascii="TH Sarabun New" w:hAnsi="TH Sarabun New" w:cs="TH Sarabun New"/>
+          <w:sz w:val="20"/>
+          <w:szCs w:val="20"/>
+          <w:cs/>
+        </w:rPr>
+      </w:pPr>
+      <w:r>
+        <w:rPr>
+          <w:rFonts w:ascii="TH Sarabun New" w:hAnsi="TH Sarabun New" w:cs="TH Sarabun New"/>
+          <w:sz w:val="20"/>
+          <w:szCs w:val="20"/>
+          <w:cs/>
+        </w:rPr>
+        <w:t xml:space="preserve">ผลรวมค่าน้ำหนักคะแนนที่ได้ เท่ากับ ๕๗-๗๐ ให้ถือว่าผลการสอนอยู่ในระดับ ชำนาญ </w:t>
+      </w:r>
+      <w:r>
+        <w:rPr>
+          <w:rFonts w:ascii="TH Sarabun New" w:hAnsi="TH Sarabun New" w:cs="TH Sarabun New"/>
+          <w:sz w:val="20"/>
+          <w:szCs w:val="20"/>
+        </w:rPr>
+        <w:tab/>
+      </w:r>
+      <w:r>
+        <w:rPr>
+          <w:rFonts w:ascii="TH Sarabun New" w:hAnsi="TH Sarabun New" w:cs="TH Sarabun New"/>
+          <w:sz w:val="20"/>
+          <w:szCs w:val="20"/>
+          <w:cs/>
+        </w:rPr>
+        <w:tab/>
       </w:r>
     </w:p>
     <w:p>
       <w:pPr>
         <w:spacing w:after="0"/>
-        <w:jc w:val="thaiDistribute"/>
         <w:rPr>
           <w:rFonts w:ascii="TH Sarabun New" w:hAnsi="TH Sarabun New" w:cs="TH Sarabun New"/>
           <w:sz w:val="20"/>
@@ -4476,29 +4502,11 @@
           <w:cs/>
         </w:rPr>
         <w:t xml:space="preserve">ผลรวมค่าน้ำหนักคะแนนที่ได้ เท่ากับ ๗๑-๘๕ ให้ถือว่าผลการสอนอยู่ในระดับ ชำนาญพิเศษ </w:t>
-      </w:r>
-      <w:r>
-        <w:rPr>
-          <w:rFonts w:ascii="TH Sarabun New" w:hAnsi="TH Sarabun New" w:cs="TH Sarabun New" w:hint="cs"/>
-          <w:sz w:val="20"/>
-          <w:szCs w:val="20"/>
-          <w:cs/>
-        </w:rPr>
-        <w:t xml:space="preserve">              </w:t>
-      </w:r>
-      <w:r>
-        <w:rPr>
-          <w:rFonts w:ascii="TH Sarabun New" w:hAnsi="TH Sarabun New" w:cs="TH Sarabun New"/>
-          <w:sz w:val="20"/>
-          <w:szCs w:val="20"/>
-        </w:rPr>
-        <w:t xml:space="preserve">                              </w:t>
       </w:r>
     </w:p>
     <w:p>
       <w:pPr>
-        <w:spacing w:after="0" w:line="240" w:lineRule="auto"/>
-        <w:jc w:val="thaiDistribute"/>
+        <w:spacing w:after="0"/>
         <w:rPr>
           <w:rFonts w:ascii="TH Sarabun New" w:hAnsi="TH Sarabun New" w:cs="TH Sarabun New"/>
           <w:sz w:val="20"/>
@@ -4513,46 +4521,11 @@
           <w:cs/>
         </w:rPr>
         <w:t>ผลรวมค่าน้ำหนักคะแนนที่ได้ เท่ากับ ๘๖-๑๐๐ ให้ถือว่าผลการสอนอยู่ในระดับ เชี่ยวชาญ</w:t>
-      </w:r>
-      <w:r>
-        <w:rPr>
-          <w:rFonts w:ascii="TH Sarabun New" w:hAnsi="TH Sarabun New" w:cs="TH Sarabun New" w:hint="cs"/>
-          <w:sz w:val="20"/>
-          <w:szCs w:val="20"/>
-          <w:cs/>
-        </w:rPr>
-        <w:t xml:space="preserve">                       </w:t>
-      </w:r>
-      <w:r>
-        <w:rPr>
-          <w:rFonts w:ascii="TH Sarabun New" w:hAnsi="TH Sarabun New" w:cs="TH Sarabun New"/>
-          <w:sz w:val="20"/>
-          <w:szCs w:val="20"/>
-        </w:rPr>
-        <w:t xml:space="preserve">  </w:t>
-      </w:r>
-      <w:r>
-        <w:rPr>
-          <w:rFonts w:ascii="TH Sarabun New" w:hAnsi="TH Sarabun New" w:cs="TH Sarabun New" w:hint="cs"/>
-          <w:sz w:val="20"/>
-          <w:szCs w:val="20"/>
-          <w:cs/>
-        </w:rPr>
-        <w:t xml:space="preserve"> </w:t>
-      </w:r>
-      <w:r>
-        <w:rPr>
-          <w:rFonts w:ascii="TH Sarabun New" w:hAnsi="TH Sarabun New" w:cs="TH Sarabun New"/>
-          <w:sz w:val="20"/>
-          <w:szCs w:val="20"/>
-        </w:rPr>
-        <w:t xml:space="preserve">                        </w:t>
       </w:r>
     </w:p>
     <w:p>
       <w:pPr>
-        <w:spacing w:after="0" w:line="240" w:lineRule="auto"/>
-        <w:jc w:val="thaiDistribute"/>
+        <w:spacing w:after="0"/>
         <w:rPr>
           <w:rFonts w:ascii="TH Sarabun New" w:hAnsi="TH Sarabun New" w:cs="TH Sarabun New"/>
           <w:szCs w:val="22"/>
@@ -4564,26 +4537,12 @@
           <w:szCs w:val="22"/>
           <w:cs/>
         </w:rPr>
-        <w:t>ผู้ช่วยศาสตราจารย์ ต้องมีผลการประเมินไม่ต่ำกว่าระดับชำนาญรองศาสตราจารย์</w:t>
-      </w:r>
-      <w:r>
-        <w:rPr>
-          <w:rFonts w:ascii="TH Sarabun New" w:hAnsi="TH Sarabun New" w:cs="TH Sarabun New"/>
-          <w:szCs w:val="22"/>
-        </w:rPr>
-        <w:t xml:space="preserve">                </w:t>
-      </w:r>
-      <w:r>
-        <w:rPr>
-          <w:rFonts w:ascii="TH Sarabun New" w:hAnsi="TH Sarabun New" w:cs="TH Sarabun New"/>
-          <w:szCs w:val="22"/>
-        </w:rPr>
-        <w:t xml:space="preserve">                              </w:t>
+        <w:t>ผู้ช่วยศาสตราจารย์ ต้องมีผลการประเมินไม่ต่ำกว่าระดับชำนาญ</w:t>
       </w:r>
     </w:p>
     <w:p>
       <w:pPr>
-        <w:spacing w:after="0" w:line="240" w:lineRule="auto"/>
+        <w:spacing w:after="0"/>
         <w:rPr>
           <w:rFonts w:ascii="TH Sarabun New" w:hAnsi="TH Sarabun New" w:cs="TH Sarabun New"/>
           <w:szCs w:val="22"/>
@@ -4595,14 +4554,14 @@
           <w:szCs w:val="22"/>
           <w:cs/>
         </w:rPr>
-        <w:t>ต้องมีผลการประเมินไม่ต่ำกว่าระดับชำนาญพิเศษ</w:t>
+        <w:t>รองศาสตราจารย์ ต้องมีผลการประเมินไม่ต่ำกว่าระดับชำนาญพิเศษ</w:t>
       </w:r>
       <w:r>
         <w:rPr>
           <w:rFonts w:ascii="TH Sarabun New" w:hAnsi="TH Sarabun New" w:cs="TH Sarabun New"/>
           <w:szCs w:val="22"/>
         </w:rPr>
-        <w:t xml:space="preserve">                                                                                                       </w:t>
+        <w:t xml:space="preserve"> </w:t>
       </w:r>
     </w:p>
     <w:sectPr>

</xml_diff>

<commit_message>
Formalize signer emails and briefing context
This change upgrades the system emails to formal Thai letter style with clear subjects, salutations, and action-oriented guidance for status updates, OTP/password mails, and signer notices. It also adds SignerBriefing context so external signer invitations explain which request and role they are being asked to sign, and updates the related tests and email templates to validate the new behavior.
</commit_message>
<xml_diff>
--- a/HRCP-KKU-Academic/src/main/resources/templates/docx/doc_7.docx
+++ b/HRCP-KKU-Academic/src/main/resources/templates/docx/doc_7.docx
@@ -3790,7 +3790,7 @@
                 <wp:positionV relativeFrom="paragraph">
                   <wp:posOffset>182160</wp:posOffset>
                 </wp:positionV>
-                <wp:extent cx="2763672" cy="1828800"/>
+                <wp:extent cx="2763672" cy="3492500"/>
                 <wp:effectExtent l="0" t="0" r="0" b="0"/>
                 <wp:wrapNone/>
                 <wp:docPr id="1429186260" name="กล่องข้อความ 2"/>
@@ -3806,7 +3806,7 @@
                       <wps:spPr bwMode="auto">
                         <a:xfrm>
                           <a:off x="0" y="0"/>
-                          <a:ext cx="2763672" cy="1828800"/>
+                          <a:ext cx="2763672" cy="3492500"/>
                         </a:xfrm>
                         <a:prstGeom prst="rect">
                           <a:avLst/>
@@ -4039,7 +4039,7 @@
                 <v:stroke joinstyle="miter"/>
                 <v:path gradientshapeok="t" o:connecttype="rect"/>
               </v:shapetype>
-              <v:shape id="กล่องข้อความ 2" o:spid="_x0000_s1026" type="#_x0000_t202" style="position:absolute;margin-left:265.45pt;margin-top:14.35pt;width:217.6pt;height:2in;z-index:251681792;visibility:visible;mso-wrap-style:square;mso-width-percent:0;mso-height-percent:0;mso-wrap-distance-left:9pt;mso-wrap-distance-top:3.6pt;mso-wrap-distance-right:9pt;mso-wrap-distance-bottom:3.6pt;mso-position-horizontal:absolute;mso-position-horizontal-relative:margin;mso-position-vertical:absolute;mso-position-vertical-relative:text;mso-width-percent:0;mso-height-percent:0;mso-width-relative:margin;mso-height-relative:margin;v-text-anchor:top" o:gfxdata="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" stroked="f">
+              <v:shape id="กล่องข้อความ 2" o:spid="_x0000_s1026" type="#_x0000_t202" style="position:absolute;margin-left:265.45pt;margin-top:14.35pt;width:217.6pt;height:275pt;z-index:251681792;visibility:visible;mso-wrap-style:square;mso-width-percent:0;mso-height-percent:0;mso-wrap-distance-left:9pt;mso-wrap-distance-top:3.6pt;mso-wrap-distance-right:9pt;mso-wrap-distance-bottom:3.6pt;mso-position-horizontal:absolute;mso-position-horizontal-relative:margin;mso-position-vertical:absolute;mso-position-vertical-relative:text;mso-width-percent:0;mso-height-percent:0;mso-width-relative:margin;mso-height-relative:margin;v-text-anchor:top" o:gfxdata="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" stroked="f">
                 <v:textbox>
                   <w:txbxContent>
                     <w:p>

</xml_diff>

<commit_message>
Fix result letter flow and signing rendering
Updates the academic document workflow so doc 9 is treated as issued only after dean signing completes, then unlocks applicant visibility and sends in-app/email notifications with the issued letter details. Doc 9 fields are now mostly carried from docs 1/7/8 as read-only, expiration is derived from issue date (+3 years minus 1 day), and status advancement now includes doc 8 -> COLLEGE_ENDORSED handling before completion. It also improves signed output reliability by fixing signature placement/scaling in text boxes, preserving Thai numerals in incremental PDF fills, adjusting slot marker sizing for LibreOffice export, and introduces a custom 24-hour time picker UI for doc 5.
</commit_message>
<xml_diff>
--- a/HRCP-KKU-Academic/src/main/resources/templates/docx/doc_7.docx
+++ b/HRCP-KKU-Academic/src/main/resources/templates/docx/doc_7.docx
@@ -606,7 +606,9 @@
       </w:tr>
       <w:tr>
         <w:trPr>
+          <w:cantSplit/>
           <w:trHeight w:val="267"/>
+          <w:tblHeader/>
           <w:jc w:val="center"/>
         </w:trPr>
         <w:tc>
@@ -799,7 +801,9 @@
       </w:tr>
       <w:tr>
         <w:trPr>
-          <w:trHeight w:val="75"/>
+          <w:cantSplit/>
+          <w:trHeight w:val="940"/>
+          <w:tblHeader/>
           <w:jc w:val="center"/>
         </w:trPr>
         <w:tc>
@@ -2514,7 +2518,17 @@
                 <w:szCs w:val="20"/>
                 <w:cs/>
               </w:rPr>
-              <w:t>-เอกสารสรุปสาระสำคัญของเนื้อหาของส่วนที่ผู้ขอเป็นผู้สอน                                      -สื่อการสอนทุกประเภทที่ใช้ในการเรียนการสอน                                                         -ผลการประเมินโดยนักศึกษา และ/</w:t>
+              <w:t>-เอกสารสรุปสาระสำคัญของเนื้อหาของส่วนที่ผู้ขอเป็นผู้สอน                                      -สื่อการสอนทุกประเภทที่ใช้ในการเรียนการสอน                                                         -ผลการประเมินโดย</w:t>
+            </w:r>
+            <w:r>
+              <w:rPr>
+                <w:rFonts w:ascii="TH Sarabun New" w:hAnsi="TH Sarabun New" w:cs="TH Sarabun New"/>
+                <w:sz w:val="20"/>
+                <w:szCs w:val="20"/>
+                <w:cs/>
+              </w:rPr>
+              <w:lastRenderedPageBreak/>
+              <w:t>นักศึกษา และ/</w:t>
             </w:r>
             <w:r>
               <w:rPr>
@@ -2532,17 +2546,7 @@
                 <w:szCs w:val="20"/>
                 <w:cs/>
               </w:rPr>
-              <w:t>หรือผู้มีส่วน</w:t>
-            </w:r>
-            <w:r>
-              <w:rPr>
-                <w:rFonts w:ascii="TH Sarabun New" w:hAnsi="TH Sarabun New" w:cs="TH Sarabun New"/>
-                <w:sz w:val="20"/>
-                <w:szCs w:val="20"/>
-                <w:cs/>
-              </w:rPr>
-              <w:lastRenderedPageBreak/>
-              <w:t>เกี่ยวข้อง                                                   -ข้อมูลอื่น ๆ ที่เกี่ยวข้อง</w:t>
+              <w:t>หรือผู้มีส่วนเกี่ยวข้อง                                                   -ข้อมูลอื่น ๆ ที่เกี่ยวข้อง</w:t>
             </w:r>
           </w:p>
         </w:tc>
@@ -3599,181 +3603,6 @@
       <w:r>
         <w:rPr>
           <w:rFonts w:ascii="TH Sarabun New" w:hAnsi="TH Sarabun New" w:cs="TH Sarabun New"/>
-          <w:sz w:val="20"/>
-          <w:szCs w:val="20"/>
-          <w:cs/>
-        </w:rPr>
-        <w:t>๓. ความสามารถด้านการจัดการเรียนการสอน</w:t>
-      </w:r>
-      <w:r>
-        <w:rPr>
-          <w:rFonts w:ascii="TH Sarabun New" w:hAnsi="TH Sarabun New" w:cs="TH Sarabun New"/>
-          <w:sz w:val="20"/>
-          <w:szCs w:val="20"/>
-          <w:cs/>
-        </w:rPr>
-        <w:tab/>
-      </w:r>
-      <w:r>
-        <w:rPr>
-          <w:rFonts w:ascii="TH Sarabun New" w:hAnsi="TH Sarabun New" w:cs="TH Sarabun New"/>
-          <w:sz w:val="20"/>
-          <w:szCs w:val="20"/>
-          <w:cs/>
-        </w:rPr>
-        <w:tab/>
-      </w:r>
-      <w:r>
-        <w:rPr>
-          <w:rFonts w:ascii="TH Sarabun New" w:hAnsi="TH Sarabun New" w:cs="TH Sarabun New"/>
-          <w:sz w:val="20"/>
-          <w:szCs w:val="20"/>
-          <w:cs/>
-        </w:rPr>
-        <w:tab/>
-      </w:r>
-      <w:r>
-        <w:rPr>
-          <w:rFonts w:ascii="TH Sarabun New" w:hAnsi="TH Sarabun New" w:cs="TH Sarabun New"/>
-          <w:sz w:val="20"/>
-          <w:szCs w:val="20"/>
-        </w:rPr>
-        <w:t>{{score</w:t>
-      </w:r>
-      <w:r>
-        <w:rPr>
-          <w:rFonts w:ascii="TH Sarabun New" w:hAnsi="TH Sarabun New" w:cs="TH Sarabun New"/>
-          <w:sz w:val="20"/>
-          <w:szCs w:val="20"/>
-        </w:rPr>
-        <w:t>3</w:t>
-      </w:r>
-      <w:r>
-        <w:rPr>
-          <w:rFonts w:ascii="TH Sarabun New" w:hAnsi="TH Sarabun New" w:cs="TH Sarabun New"/>
-          <w:sz w:val="20"/>
-          <w:szCs w:val="20"/>
-        </w:rPr>
-        <w:t>x}}</w:t>
-      </w:r>
-      <w:r>
-        <w:rPr>
-          <w:rFonts w:ascii="TH Sarabun New" w:hAnsi="TH Sarabun New" w:cs="TH Sarabun New" w:hint="cs"/>
-          <w:sz w:val="20"/>
-          <w:szCs w:val="20"/>
-          <w:cs/>
-        </w:rPr>
-        <w:t xml:space="preserve"> </w:t>
-      </w:r>
-      <w:r>
-        <w:rPr>
-          <w:rFonts w:ascii="TH Sarabun New" w:hAnsi="TH Sarabun New" w:cs="TH Sarabun New"/>
-          <w:sz w:val="20"/>
-          <w:szCs w:val="20"/>
-          <w:cs/>
-        </w:rPr>
-        <w:t>คะแนน</w:t>
-      </w:r>
-    </w:p>
-    <w:p>
-      <w:pPr>
-        <w:spacing w:after="0"/>
-        <w:rPr>
-          <w:rFonts w:ascii="TH Sarabun New" w:hAnsi="TH Sarabun New" w:cs="TH Sarabun New"/>
-          <w:sz w:val="20"/>
-          <w:szCs w:val="20"/>
-          <w:cs/>
-        </w:rPr>
-      </w:pPr>
-      <w:r>
-        <w:rPr>
-          <w:rFonts w:ascii="TH Sarabun New" w:hAnsi="TH Sarabun New" w:cs="TH Sarabun New"/>
-          <w:sz w:val="20"/>
-          <w:szCs w:val="20"/>
-          <w:cs/>
-        </w:rPr>
-        <w:t>๔. ความเป็นผู้มีคุณธรรมจริยธรรม และวิญญาณความเป็นครู</w:t>
-      </w:r>
-      <w:r>
-        <w:rPr>
-          <w:rFonts w:ascii="TH Sarabun New" w:hAnsi="TH Sarabun New" w:cs="TH Sarabun New"/>
-          <w:sz w:val="20"/>
-          <w:szCs w:val="20"/>
-        </w:rPr>
-        <w:tab/>
-      </w:r>
-      <w:r>
-        <w:rPr>
-          <w:rFonts w:ascii="TH Sarabun New" w:hAnsi="TH Sarabun New" w:cs="TH Sarabun New"/>
-          <w:sz w:val="20"/>
-          <w:szCs w:val="20"/>
-        </w:rPr>
-        <w:tab/>
-      </w:r>
-      <w:r>
-        <w:rPr>
-          <w:rFonts w:ascii="TH Sarabun New" w:hAnsi="TH Sarabun New" w:cs="TH Sarabun New"/>
-          <w:sz w:val="20"/>
-          <w:szCs w:val="20"/>
-        </w:rPr>
-        <w:t>{{score</w:t>
-      </w:r>
-      <w:r>
-        <w:rPr>
-          <w:rFonts w:ascii="TH Sarabun New" w:hAnsi="TH Sarabun New" w:cs="TH Sarabun New"/>
-          <w:sz w:val="20"/>
-          <w:szCs w:val="20"/>
-        </w:rPr>
-        <w:t>4</w:t>
-      </w:r>
-      <w:r>
-        <w:rPr>
-          <w:rFonts w:ascii="TH Sarabun New" w:hAnsi="TH Sarabun New" w:cs="TH Sarabun New"/>
-          <w:sz w:val="20"/>
-          <w:szCs w:val="20"/>
-        </w:rPr>
-        <w:t>x}}</w:t>
-      </w:r>
-      <w:r>
-        <w:rPr>
-          <w:rFonts w:ascii="TH Sarabun New" w:hAnsi="TH Sarabun New" w:cs="TH Sarabun New" w:hint="cs"/>
-          <w:sz w:val="20"/>
-          <w:szCs w:val="20"/>
-          <w:cs/>
-        </w:rPr>
-        <w:t xml:space="preserve"> </w:t>
-      </w:r>
-      <w:r>
-        <w:rPr>
-          <w:rFonts w:ascii="TH Sarabun New" w:hAnsi="TH Sarabun New" w:cs="TH Sarabun New"/>
-          <w:sz w:val="20"/>
-          <w:szCs w:val="20"/>
-          <w:cs/>
-        </w:rPr>
-        <w:t xml:space="preserve">คะแนน </w:t>
-      </w:r>
-      <w:r>
-        <w:rPr>
-          <w:rFonts w:ascii="TH Sarabun New" w:hAnsi="TH Sarabun New" w:cs="TH Sarabun New"/>
-          <w:sz w:val="20"/>
-          <w:szCs w:val="20"/>
-          <w:cs/>
-        </w:rPr>
-        <w:tab/>
-      </w:r>
-    </w:p>
-    <w:p>
-      <w:pPr>
-        <w:spacing w:after="0"/>
-        <w:rPr>
-          <w:rFonts w:ascii="TH Sarabun New" w:hAnsi="TH Sarabun New" w:cs="TH Sarabun New"/>
-          <w:sz w:val="20"/>
-          <w:szCs w:val="20"/>
-        </w:rPr>
-      </w:pPr>
-      <w:r>
-        <w:rPr>
-          <w:rFonts w:ascii="TH Sarabun New" w:hAnsi="TH Sarabun New" w:cs="TH Sarabun New"/>
           <w:noProof/>
           <w:sz w:val="20"/>
           <w:szCs w:val="20"/>
@@ -3782,15 +3611,15 @@
         <mc:AlternateContent>
           <mc:Choice Requires="wps">
             <w:drawing>
-              <wp:anchor distT="45720" distB="45720" distL="114300" distR="114300" simplePos="0" relativeHeight="251681792" behindDoc="0" locked="0" layoutInCell="1" allowOverlap="1" wp14:anchorId="37782657" wp14:editId="1763A0BD">
+              <wp:anchor distT="45720" distB="45720" distL="114300" distR="114300" simplePos="0" relativeHeight="251681792" behindDoc="0" locked="0" layoutInCell="1" allowOverlap="1" wp14:anchorId="37782657" wp14:editId="16163C57">
                 <wp:simplePos x="0" y="0"/>
                 <wp:positionH relativeFrom="margin">
-                  <wp:posOffset>3370997</wp:posOffset>
+                  <wp:posOffset>3547745</wp:posOffset>
                 </wp:positionH>
                 <wp:positionV relativeFrom="paragraph">
-                  <wp:posOffset>182160</wp:posOffset>
+                  <wp:posOffset>11430</wp:posOffset>
                 </wp:positionV>
-                <wp:extent cx="2763672" cy="3492500"/>
+                <wp:extent cx="2763672" cy="2484120"/>
                 <wp:effectExtent l="0" t="0" r="0" b="0"/>
                 <wp:wrapNone/>
                 <wp:docPr id="1429186260" name="กล่องข้อความ 2"/>
@@ -3806,7 +3635,7 @@
                       <wps:spPr bwMode="auto">
                         <a:xfrm>
                           <a:off x="0" y="0"/>
-                          <a:ext cx="2763672" cy="3492500"/>
+                          <a:ext cx="2763672" cy="2484120"/>
                         </a:xfrm>
                         <a:prstGeom prst="rect">
                           <a:avLst/>
@@ -3890,17 +3719,6 @@
                                 <w:szCs w:val="24"/>
                               </w:rPr>
                             </w:pPr>
-                          </w:p>
-                          <w:p>
-                            <w:pPr>
-                              <w:spacing w:after="0" w:line="240" w:lineRule="auto"/>
-                              <w:jc w:val="center"/>
-                              <w:rPr>
-                                <w:rFonts w:ascii="TH Sarabun New" w:hAnsi="TH Sarabun New" w:cs="TH Sarabun New"/>
-                                <w:sz w:val="24"/>
-                                <w:szCs w:val="24"/>
-                              </w:rPr>
-                            </w:pPr>
                             <w:r>
                               <w:rPr>
                                 <w:rFonts w:ascii="TH Sarabun New" w:hAnsi="TH Sarabun New" w:cs="TH Sarabun New"/>
@@ -3947,17 +3765,6 @@
                               </w:rPr>
                               <w:t>)</w:t>
                             </w:r>
-                          </w:p>
-                          <w:p>
-                            <w:pPr>
-                              <w:spacing w:after="0" w:line="240" w:lineRule="auto"/>
-                              <w:jc w:val="center"/>
-                              <w:rPr>
-                                <w:rFonts w:ascii="TH Sarabun New" w:hAnsi="TH Sarabun New" w:cs="TH Sarabun New"/>
-                                <w:sz w:val="24"/>
-                                <w:szCs w:val="24"/>
-                              </w:rPr>
-                            </w:pPr>
                           </w:p>
                           <w:p>
                             <w:pPr>
@@ -4039,7 +3846,7 @@
                 <v:stroke joinstyle="miter"/>
                 <v:path gradientshapeok="t" o:connecttype="rect"/>
               </v:shapetype>
-              <v:shape id="กล่องข้อความ 2" o:spid="_x0000_s1026" type="#_x0000_t202" style="position:absolute;margin-left:265.45pt;margin-top:14.35pt;width:217.6pt;height:275pt;z-index:251681792;visibility:visible;mso-wrap-style:square;mso-width-percent:0;mso-height-percent:0;mso-wrap-distance-left:9pt;mso-wrap-distance-top:3.6pt;mso-wrap-distance-right:9pt;mso-wrap-distance-bottom:3.6pt;mso-position-horizontal:absolute;mso-position-horizontal-relative:margin;mso-position-vertical:absolute;mso-position-vertical-relative:text;mso-width-percent:0;mso-height-percent:0;mso-width-relative:margin;mso-height-relative:margin;v-text-anchor:top" o:gfxdata="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" stroked="f">
+              <v:shape id="กล่องข้อความ 2" o:spid="_x0000_s1026" type="#_x0000_t202" style="position:absolute;margin-left:279.35pt;margin-top:.9pt;width:217.6pt;height:195.6pt;z-index:251681792;visibility:visible;mso-wrap-style:square;mso-width-percent:0;mso-height-percent:0;mso-wrap-distance-left:9pt;mso-wrap-distance-top:3.6pt;mso-wrap-distance-right:9pt;mso-wrap-distance-bottom:3.6pt;mso-position-horizontal:absolute;mso-position-horizontal-relative:margin;mso-position-vertical:absolute;mso-position-vertical-relative:text;mso-width-percent:0;mso-height-percent:0;mso-width-relative:margin;mso-height-relative:margin;v-text-anchor:top" o:gfxdata="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" stroked="f">
                 <v:textbox>
                   <w:txbxContent>
                     <w:p>
@@ -4109,6 +3916,52 @@
                           <w:szCs w:val="24"/>
                         </w:rPr>
                       </w:pPr>
+                      <w:r>
+                        <w:rPr>
+                          <w:rFonts w:ascii="TH Sarabun New" w:hAnsi="TH Sarabun New" w:cs="TH Sarabun New"/>
+                          <w:sz w:val="24"/>
+                          <w:szCs w:val="24"/>
+                          <w:cs/>
+                        </w:rPr>
+                        <w:t>ชื่อ...............................................กรรมการ</w:t>
+                      </w:r>
+                    </w:p>
+                    <w:p>
+                      <w:pPr>
+                        <w:spacing w:after="0" w:line="240" w:lineRule="auto"/>
+                        <w:jc w:val="center"/>
+                        <w:rPr>
+                          <w:rFonts w:ascii="TH Sarabun New" w:hAnsi="TH Sarabun New" w:cs="TH Sarabun New"/>
+                          <w:sz w:val="24"/>
+                          <w:szCs w:val="24"/>
+                        </w:rPr>
+                      </w:pPr>
+                      <w:r>
+                        <w:rPr>
+                          <w:rFonts w:ascii="TH Sarabun New" w:hAnsi="TH Sarabun New" w:cs="TH Sarabun New"/>
+                          <w:sz w:val="24"/>
+                          <w:szCs w:val="24"/>
+                          <w:cs/>
+                        </w:rPr>
+                        <w:t>(</w:t>
+                      </w:r>
+                      <w:r>
+                        <w:rPr>
+                          <w:rFonts w:ascii="TH Sarabun New" w:hAnsi="TH Sarabun New" w:cs="TH Sarabun New"/>
+                          <w:sz w:val="24"/>
+                          <w:szCs w:val="24"/>
+                        </w:rPr>
+                        <w:t>{{committee_2_name}}</w:t>
+                      </w:r>
+                      <w:r>
+                        <w:rPr>
+                          <w:rFonts w:ascii="TH Sarabun New" w:hAnsi="TH Sarabun New" w:cs="TH Sarabun New"/>
+                          <w:sz w:val="24"/>
+                          <w:szCs w:val="24"/>
+                          <w:cs/>
+                        </w:rPr>
+                        <w:t>)</w:t>
+                      </w:r>
                     </w:p>
                     <w:p>
                       <w:pPr>
@@ -4155,107 +4008,7 @@
                           <w:sz w:val="24"/>
                           <w:szCs w:val="24"/>
                         </w:rPr>
-                        <w:t>{{committee_</w:t>
-                      </w:r>
-                      <w:r>
-                        <w:rPr>
-                          <w:rFonts w:ascii="TH Sarabun New" w:hAnsi="TH Sarabun New" w:cs="TH Sarabun New"/>
-                          <w:sz w:val="24"/>
-                          <w:szCs w:val="24"/>
-                        </w:rPr>
-                        <w:t>2</w:t>
-                      </w:r>
-                      <w:r>
-                        <w:rPr>
-                          <w:rFonts w:ascii="TH Sarabun New" w:hAnsi="TH Sarabun New" w:cs="TH Sarabun New"/>
-                          <w:sz w:val="24"/>
-                          <w:szCs w:val="24"/>
-                        </w:rPr>
-                        <w:t>_name}}</w:t>
-                      </w:r>
-                      <w:r>
-                        <w:rPr>
-                          <w:rFonts w:ascii="TH Sarabun New" w:hAnsi="TH Sarabun New" w:cs="TH Sarabun New"/>
-                          <w:sz w:val="24"/>
-                          <w:szCs w:val="24"/>
-                          <w:cs/>
-                        </w:rPr>
-                        <w:t>)</w:t>
-                      </w:r>
-                    </w:p>
-                    <w:p>
-                      <w:pPr>
-                        <w:spacing w:after="0" w:line="240" w:lineRule="auto"/>
-                        <w:jc w:val="center"/>
-                        <w:rPr>
-                          <w:rFonts w:ascii="TH Sarabun New" w:hAnsi="TH Sarabun New" w:cs="TH Sarabun New"/>
-                          <w:sz w:val="24"/>
-                          <w:szCs w:val="24"/>
-                        </w:rPr>
-                      </w:pPr>
-                    </w:p>
-                    <w:p>
-                      <w:pPr>
-                        <w:spacing w:after="0" w:line="240" w:lineRule="auto"/>
-                        <w:jc w:val="center"/>
-                        <w:rPr>
-                          <w:rFonts w:ascii="TH Sarabun New" w:hAnsi="TH Sarabun New" w:cs="TH Sarabun New"/>
-                          <w:sz w:val="24"/>
-                          <w:szCs w:val="24"/>
-                        </w:rPr>
-                      </w:pPr>
-                      <w:r>
-                        <w:rPr>
-                          <w:rFonts w:ascii="TH Sarabun New" w:hAnsi="TH Sarabun New" w:cs="TH Sarabun New"/>
-                          <w:sz w:val="24"/>
-                          <w:szCs w:val="24"/>
-                          <w:cs/>
-                        </w:rPr>
-                        <w:t>ชื่อ...............................................กรรมการ</w:t>
-                      </w:r>
-                    </w:p>
-                    <w:p>
-                      <w:pPr>
-                        <w:spacing w:after="0" w:line="240" w:lineRule="auto"/>
-                        <w:jc w:val="center"/>
-                        <w:rPr>
-                          <w:rFonts w:ascii="TH Sarabun New" w:hAnsi="TH Sarabun New" w:cs="TH Sarabun New"/>
-                          <w:sz w:val="24"/>
-                          <w:szCs w:val="24"/>
-                        </w:rPr>
-                      </w:pPr>
-                      <w:r>
-                        <w:rPr>
-                          <w:rFonts w:ascii="TH Sarabun New" w:hAnsi="TH Sarabun New" w:cs="TH Sarabun New"/>
-                          <w:sz w:val="24"/>
-                          <w:szCs w:val="24"/>
-                          <w:cs/>
-                        </w:rPr>
-                        <w:t>(</w:t>
-                      </w:r>
-                      <w:r>
-                        <w:rPr>
-                          <w:rFonts w:ascii="TH Sarabun New" w:hAnsi="TH Sarabun New" w:cs="TH Sarabun New"/>
-                          <w:sz w:val="24"/>
-                          <w:szCs w:val="24"/>
-                        </w:rPr>
-                        <w:t>{{committee_</w:t>
-                      </w:r>
-                      <w:r>
-                        <w:rPr>
-                          <w:rFonts w:ascii="TH Sarabun New" w:hAnsi="TH Sarabun New" w:cs="TH Sarabun New"/>
-                          <w:sz w:val="24"/>
-                          <w:szCs w:val="24"/>
-                        </w:rPr>
-                        <w:t>3</w:t>
-                      </w:r>
-                      <w:r>
-                        <w:rPr>
-                          <w:rFonts w:ascii="TH Sarabun New" w:hAnsi="TH Sarabun New" w:cs="TH Sarabun New"/>
-                          <w:sz w:val="24"/>
-                          <w:szCs w:val="24"/>
-                        </w:rPr>
-                        <w:t>_name}}</w:t>
+                        <w:t>{{committee_3_name}}</w:t>
                       </w:r>
                       <w:r>
                         <w:rPr>
@@ -4278,6 +4031,181 @@
       <w:r>
         <w:rPr>
           <w:rFonts w:ascii="TH Sarabun New" w:hAnsi="TH Sarabun New" w:cs="TH Sarabun New"/>
+          <w:sz w:val="20"/>
+          <w:szCs w:val="20"/>
+          <w:cs/>
+        </w:rPr>
+        <w:t>๓. ความสามารถด้านการจัดการเรียนการสอน</w:t>
+      </w:r>
+      <w:r>
+        <w:rPr>
+          <w:rFonts w:ascii="TH Sarabun New" w:hAnsi="TH Sarabun New" w:cs="TH Sarabun New"/>
+          <w:sz w:val="20"/>
+          <w:szCs w:val="20"/>
+          <w:cs/>
+        </w:rPr>
+        <w:tab/>
+      </w:r>
+      <w:r>
+        <w:rPr>
+          <w:rFonts w:ascii="TH Sarabun New" w:hAnsi="TH Sarabun New" w:cs="TH Sarabun New"/>
+          <w:sz w:val="20"/>
+          <w:szCs w:val="20"/>
+          <w:cs/>
+        </w:rPr>
+        <w:tab/>
+      </w:r>
+      <w:r>
+        <w:rPr>
+          <w:rFonts w:ascii="TH Sarabun New" w:hAnsi="TH Sarabun New" w:cs="TH Sarabun New"/>
+          <w:sz w:val="20"/>
+          <w:szCs w:val="20"/>
+          <w:cs/>
+        </w:rPr>
+        <w:tab/>
+      </w:r>
+      <w:r>
+        <w:rPr>
+          <w:rFonts w:ascii="TH Sarabun New" w:hAnsi="TH Sarabun New" w:cs="TH Sarabun New"/>
+          <w:sz w:val="20"/>
+          <w:szCs w:val="20"/>
+        </w:rPr>
+        <w:t>{{score</w:t>
+      </w:r>
+      <w:r>
+        <w:rPr>
+          <w:rFonts w:ascii="TH Sarabun New" w:hAnsi="TH Sarabun New" w:cs="TH Sarabun New"/>
+          <w:sz w:val="20"/>
+          <w:szCs w:val="20"/>
+        </w:rPr>
+        <w:t>3</w:t>
+      </w:r>
+      <w:r>
+        <w:rPr>
+          <w:rFonts w:ascii="TH Sarabun New" w:hAnsi="TH Sarabun New" w:cs="TH Sarabun New"/>
+          <w:sz w:val="20"/>
+          <w:szCs w:val="20"/>
+        </w:rPr>
+        <w:t>x}}</w:t>
+      </w:r>
+      <w:r>
+        <w:rPr>
+          <w:rFonts w:ascii="TH Sarabun New" w:hAnsi="TH Sarabun New" w:cs="TH Sarabun New" w:hint="cs"/>
+          <w:sz w:val="20"/>
+          <w:szCs w:val="20"/>
+          <w:cs/>
+        </w:rPr>
+        <w:t xml:space="preserve"> </w:t>
+      </w:r>
+      <w:r>
+        <w:rPr>
+          <w:rFonts w:ascii="TH Sarabun New" w:hAnsi="TH Sarabun New" w:cs="TH Sarabun New"/>
+          <w:sz w:val="20"/>
+          <w:szCs w:val="20"/>
+          <w:cs/>
+        </w:rPr>
+        <w:t>คะแนน</w:t>
+      </w:r>
+    </w:p>
+    <w:p>
+      <w:pPr>
+        <w:spacing w:after="0"/>
+        <w:rPr>
+          <w:rFonts w:ascii="TH Sarabun New" w:hAnsi="TH Sarabun New" w:cs="TH Sarabun New"/>
+          <w:sz w:val="20"/>
+          <w:szCs w:val="20"/>
+          <w:cs/>
+        </w:rPr>
+      </w:pPr>
+      <w:r>
+        <w:rPr>
+          <w:rFonts w:ascii="TH Sarabun New" w:hAnsi="TH Sarabun New" w:cs="TH Sarabun New"/>
+          <w:sz w:val="20"/>
+          <w:szCs w:val="20"/>
+          <w:cs/>
+        </w:rPr>
+        <w:t>๔. ความเป็นผู้มีคุณธรรมจริยธรรม และวิญญาณความเป็นครู</w:t>
+      </w:r>
+      <w:r>
+        <w:rPr>
+          <w:rFonts w:ascii="TH Sarabun New" w:hAnsi="TH Sarabun New" w:cs="TH Sarabun New"/>
+          <w:sz w:val="20"/>
+          <w:szCs w:val="20"/>
+        </w:rPr>
+        <w:tab/>
+      </w:r>
+      <w:r>
+        <w:rPr>
+          <w:rFonts w:ascii="TH Sarabun New" w:hAnsi="TH Sarabun New" w:cs="TH Sarabun New"/>
+          <w:sz w:val="20"/>
+          <w:szCs w:val="20"/>
+        </w:rPr>
+        <w:tab/>
+      </w:r>
+      <w:r>
+        <w:rPr>
+          <w:rFonts w:ascii="TH Sarabun New" w:hAnsi="TH Sarabun New" w:cs="TH Sarabun New"/>
+          <w:sz w:val="20"/>
+          <w:szCs w:val="20"/>
+        </w:rPr>
+        <w:t>{{score</w:t>
+      </w:r>
+      <w:r>
+        <w:rPr>
+          <w:rFonts w:ascii="TH Sarabun New" w:hAnsi="TH Sarabun New" w:cs="TH Sarabun New"/>
+          <w:sz w:val="20"/>
+          <w:szCs w:val="20"/>
+        </w:rPr>
+        <w:t>4</w:t>
+      </w:r>
+      <w:r>
+        <w:rPr>
+          <w:rFonts w:ascii="TH Sarabun New" w:hAnsi="TH Sarabun New" w:cs="TH Sarabun New"/>
+          <w:sz w:val="20"/>
+          <w:szCs w:val="20"/>
+        </w:rPr>
+        <w:t>x}}</w:t>
+      </w:r>
+      <w:r>
+        <w:rPr>
+          <w:rFonts w:ascii="TH Sarabun New" w:hAnsi="TH Sarabun New" w:cs="TH Sarabun New" w:hint="cs"/>
+          <w:sz w:val="20"/>
+          <w:szCs w:val="20"/>
+          <w:cs/>
+        </w:rPr>
+        <w:t xml:space="preserve"> </w:t>
+      </w:r>
+      <w:r>
+        <w:rPr>
+          <w:rFonts w:ascii="TH Sarabun New" w:hAnsi="TH Sarabun New" w:cs="TH Sarabun New"/>
+          <w:sz w:val="20"/>
+          <w:szCs w:val="20"/>
+          <w:cs/>
+        </w:rPr>
+        <w:t xml:space="preserve">คะแนน </w:t>
+      </w:r>
+      <w:r>
+        <w:rPr>
+          <w:rFonts w:ascii="TH Sarabun New" w:hAnsi="TH Sarabun New" w:cs="TH Sarabun New"/>
+          <w:sz w:val="20"/>
+          <w:szCs w:val="20"/>
+          <w:cs/>
+        </w:rPr>
+        <w:tab/>
+      </w:r>
+    </w:p>
+    <w:p>
+      <w:pPr>
+        <w:spacing w:after="0"/>
+        <w:rPr>
+          <w:rFonts w:ascii="TH Sarabun New" w:hAnsi="TH Sarabun New" w:cs="TH Sarabun New"/>
+          <w:sz w:val="20"/>
+          <w:szCs w:val="20"/>
+        </w:rPr>
+      </w:pPr>
+      <w:r>
+        <w:rPr>
+          <w:rFonts w:ascii="TH Sarabun New" w:hAnsi="TH Sarabun New" w:cs="TH Sarabun New"/>
           <w:b/>
           <w:bCs/>
           <w:sz w:val="20"/>
@@ -4452,7 +4380,7 @@
       <w:pPr>
         <w:spacing w:after="0"/>
         <w:rPr>
-          <w:rFonts w:ascii="TH Sarabun New" w:hAnsi="TH Sarabun New" w:cs="TH Sarabun New"/>
+          <w:rFonts w:ascii="TH Sarabun New" w:hAnsi="TH Sarabun New" w:cs="TH Sarabun New" w:hint="cs"/>
           <w:sz w:val="20"/>
           <w:szCs w:val="20"/>
           <w:cs/>

</xml_diff>